<commit_message>
update content and reorganize directory structure
</commit_message>
<xml_diff>
--- a/个人笔记/算法与LeetCode笔记.docx
+++ b/个人笔记/算法与LeetCode笔记.docx
@@ -7712,6 +7712,19 @@
         <w:t>这题算是一定程度上练到了我模拟的能力吧。我是想到了通过一个数组，去记录在这一天买入，可以获得的最大收益之类的，但是这里就涉及到，在一天买入，一直走到最大收益，没有办法确保全局最大（1，3，2，4）当然我的算法对这一步进行了优化。</w:t>
       </w:r>
       <w:bookmarkStart w:id="19" w:name="_Hlk236233599"/>
+    </w:p>
+    <w:p>
+      <w:pPr>
+        <w:autoSpaceDE w:val="0"/>
+        <w:autoSpaceDN w:val="0"/>
+        <w:adjustRightInd w:val="0"/>
+        <w:spacing w:after="0" w:line="240" w:lineRule="auto"/>
+        <w:rPr>
+          <w:rFonts w:ascii="微软雅黑" w:eastAsia="微软雅黑" w:hAnsi="微软雅黑" w:cs="Helvetica Neue"/>
+          <w:kern w:val="0"/>
+          <w:sz w:val="24"/>
+        </w:rPr>
+      </w:pPr>
       <w:r>
         <w:rPr>
           <w:rFonts w:ascii="微软雅黑" w:eastAsia="微软雅黑" w:hAnsi="微软雅黑" w:cs="Helvetica Neue" w:hint="eastAsia"/>
@@ -7729,14 +7742,15 @@
         <w:adjustRightInd w:val="0"/>
         <w:spacing w:after="0" w:line="240" w:lineRule="auto"/>
         <w:rPr>
-          <w:rFonts w:ascii="微软雅黑" w:eastAsia="微软雅黑" w:hAnsi="微软雅黑" w:cs="Helvetica Neue" w:hint="eastAsia"/>
-          <w:kern w:val="0"/>
-          <w:sz w:val="24"/>
-        </w:rPr>
-      </w:pPr>
-      <w:r>
-        <w:rPr>
-          <w:rFonts w:ascii="微软雅黑" w:eastAsia="微软雅黑" w:hAnsi="微软雅黑" w:cs="Helvetica Neue"/>
+          <w:rFonts w:ascii="微软雅黑" w:eastAsia="微软雅黑" w:hAnsi="微软雅黑" w:cs="Helvetica Neue"/>
+          <w:kern w:val="0"/>
+          <w:sz w:val="24"/>
+        </w:rPr>
+      </w:pPr>
+      <w:r>
+        <w:rPr>
+          <w:rFonts w:ascii="微软雅黑" w:eastAsia="微软雅黑" w:hAnsi="微软雅黑" w:cs="Helvetica Neue"/>
+          <w:noProof/>
           <w:kern w:val="0"/>
           <w:sz w:val="24"/>
         </w:rPr>
@@ -7796,60 +7810,68 @@
           <w:kern w:val="0"/>
           <w:sz w:val="24"/>
         </w:rPr>
-        <w:t>而失败的根本原因在于：没有把贪心的每一步做到最小的一步，步子迈大了，其实直接判断相邻两天的收益就可以了，我的代码本质上是把收益+判断分开做了的感觉，看上去非常复杂。（要看是不是有收益，又要看这个收益是不是最大的，也就是到这一步，是不是要卖出，买明天的）</w:t>
-      </w:r>
-    </w:p>
-    <w:p>
-      <w:pPr>
-        <w:autoSpaceDE w:val="0"/>
-        <w:autoSpaceDN w:val="0"/>
-        <w:adjustRightInd w:val="0"/>
-        <w:spacing w:after="0" w:line="240" w:lineRule="auto"/>
-        <w:rPr>
-          <w:rFonts w:ascii="微软雅黑" w:eastAsia="微软雅黑" w:hAnsi="微软雅黑" w:cs="Helvetica Neue"/>
-          <w:color w:val="EE0000"/>
-          <w:kern w:val="0"/>
-          <w:sz w:val="24"/>
-        </w:rPr>
-      </w:pPr>
-      <w:r>
-        <w:rPr>
-          <w:rFonts w:ascii="微软雅黑" w:eastAsia="微软雅黑" w:hAnsi="微软雅黑" w:cs="Helvetica Neue" w:hint="eastAsia"/>
-          <w:color w:val="EE0000"/>
-          <w:kern w:val="0"/>
-          <w:sz w:val="24"/>
-          <w:highlight w:val="yellow"/>
-        </w:rPr>
-        <w:t>找到问题中需要维护的最小信息！</w:t>
-      </w:r>
-    </w:p>
-    <w:p>
-      <w:pPr>
-        <w:autoSpaceDE w:val="0"/>
-        <w:autoSpaceDN w:val="0"/>
-        <w:adjustRightInd w:val="0"/>
-        <w:spacing w:after="0" w:line="240" w:lineRule="auto"/>
-        <w:rPr>
-          <w:rFonts w:ascii="微软雅黑" w:eastAsia="微软雅黑" w:hAnsi="微软雅黑" w:cs="Helvetica Neue"/>
+        <w:t>而失败的根本原因在于：没有把贪心的</w:t>
+      </w:r>
+      <w:r>
+        <w:rPr>
+          <w:rFonts w:ascii="微软雅黑" w:eastAsia="微软雅黑" w:hAnsi="微软雅黑" w:cs="Helvetica Neue" w:hint="eastAsia"/>
           <w:b/>
           <w:bCs/>
           <w:color w:val="EE0000"/>
           <w:kern w:val="0"/>
           <w:sz w:val="24"/>
-        </w:rPr>
-      </w:pPr>
-      <w:r>
-        <w:rPr>
-          <w:rFonts w:ascii="微软雅黑" w:eastAsia="微软雅黑" w:hAnsi="微软雅黑" w:cs="Helvetica Neue" w:hint="eastAsia"/>
+          <w:highlight w:val="yellow"/>
+        </w:rPr>
+        <w:t>每一步做到最小的一步</w:t>
+      </w:r>
+      <w:r>
+        <w:rPr>
+          <w:rFonts w:ascii="微软雅黑" w:eastAsia="微软雅黑" w:hAnsi="微软雅黑" w:cs="Helvetica Neue" w:hint="eastAsia"/>
+          <w:kern w:val="0"/>
+          <w:sz w:val="24"/>
+        </w:rPr>
+        <w:t>，步子迈大了，其实直接判断相邻两天的收益就可以了，我的代码本质上是把收益+判断分开做了的感觉，看上去非常复杂。（要看是不是有收益，又要看这个收益是不是最大的，也就是到这一步，是不是要卖出，买明天的）</w:t>
+      </w:r>
+    </w:p>
+    <w:p>
+      <w:pPr>
+        <w:autoSpaceDE w:val="0"/>
+        <w:autoSpaceDN w:val="0"/>
+        <w:adjustRightInd w:val="0"/>
+        <w:spacing w:after="0" w:line="240" w:lineRule="auto"/>
+        <w:rPr>
+          <w:rFonts w:ascii="微软雅黑" w:eastAsia="微软雅黑" w:hAnsi="微软雅黑" w:cs="Helvetica Neue"/>
+          <w:color w:val="EE0000"/>
+          <w:kern w:val="0"/>
+          <w:sz w:val="24"/>
+        </w:rPr>
+      </w:pPr>
+      <w:r>
+        <w:rPr>
+          <w:rFonts w:ascii="微软雅黑" w:eastAsia="微软雅黑" w:hAnsi="微软雅黑" w:cs="Helvetica Neue" w:hint="eastAsia"/>
+          <w:color w:val="EE0000"/>
+          <w:kern w:val="0"/>
+          <w:sz w:val="24"/>
+          <w:highlight w:val="yellow"/>
+        </w:rPr>
+        <w:t>找到问题中需要维护的最小信息！</w:t>
+      </w:r>
+    </w:p>
+    <w:p>
+      <w:pPr>
+        <w:autoSpaceDE w:val="0"/>
+        <w:autoSpaceDN w:val="0"/>
+        <w:adjustRightInd w:val="0"/>
+        <w:spacing w:after="0" w:line="240" w:lineRule="auto"/>
+        <w:rPr>
+          <w:rFonts w:ascii="微软雅黑" w:eastAsia="微软雅黑" w:hAnsi="微软雅黑" w:cs="Helvetica Neue"/>
           <w:b/>
           <w:bCs/>
           <w:color w:val="EE0000"/>
           <w:kern w:val="0"/>
           <w:sz w:val="24"/>
-          <w:highlight w:val="yellow"/>
-        </w:rPr>
-        <w:t>能不引入新状态</w:t>
-      </w:r>
+        </w:rPr>
+      </w:pPr>
       <w:r>
         <w:rPr>
           <w:rFonts w:ascii="微软雅黑" w:eastAsia="微软雅黑" w:hAnsi="微软雅黑" w:cs="Helvetica Neue" w:hint="eastAsia"/>
@@ -7858,8 +7880,9 @@
           <w:color w:val="EE0000"/>
           <w:kern w:val="0"/>
           <w:sz w:val="24"/>
-        </w:rPr>
-        <w:t>，</w:t>
+          <w:highlight w:val="yellow"/>
+        </w:rPr>
+        <w:t>能不引入新状态</w:t>
       </w:r>
       <w:r>
         <w:rPr>
@@ -7869,9 +7892,8 @@
           <w:color w:val="EE0000"/>
           <w:kern w:val="0"/>
           <w:sz w:val="24"/>
-          <w:highlight w:val="yellow"/>
-        </w:rPr>
-        <w:t>就不引入新状态</w:t>
+        </w:rPr>
+        <w:t>，</w:t>
       </w:r>
       <w:r>
         <w:rPr>
@@ -7881,6 +7903,18 @@
           <w:color w:val="EE0000"/>
           <w:kern w:val="0"/>
           <w:sz w:val="24"/>
+          <w:highlight w:val="yellow"/>
+        </w:rPr>
+        <w:t>就不引入新状态</w:t>
+      </w:r>
+      <w:r>
+        <w:rPr>
+          <w:rFonts w:ascii="微软雅黑" w:eastAsia="微软雅黑" w:hAnsi="微软雅黑" w:cs="Helvetica Neue" w:hint="eastAsia"/>
+          <w:b/>
+          <w:bCs/>
+          <w:color w:val="EE0000"/>
+          <w:kern w:val="0"/>
+          <w:sz w:val="24"/>
         </w:rPr>
         <w:t>（减少维护、判断出错的风险）</w:t>
       </w:r>
@@ -7963,7 +7997,7 @@
         <w:adjustRightInd w:val="0"/>
         <w:spacing w:after="0" w:line="240" w:lineRule="auto"/>
         <w:rPr>
-          <w:rFonts w:ascii="微软雅黑" w:eastAsia="微软雅黑" w:hAnsi="微软雅黑" w:cs="Helvetica Neue" w:hint="eastAsia"/>
+          <w:rFonts w:ascii="微软雅黑" w:eastAsia="微软雅黑" w:hAnsi="微软雅黑" w:cs="Helvetica Neue"/>
           <w:color w:val="EE0000"/>
           <w:kern w:val="0"/>
           <w:sz w:val="24"/>
@@ -7997,7 +8031,7 @@
         <w:adjustRightInd w:val="0"/>
         <w:spacing w:after="0" w:line="240" w:lineRule="auto"/>
         <w:rPr>
-          <w:rFonts w:ascii="微软雅黑" w:eastAsia="微软雅黑" w:hAnsi="微软雅黑" w:cs="Helvetica Neue" w:hint="eastAsia"/>
+          <w:rFonts w:ascii="微软雅黑" w:eastAsia="微软雅黑" w:hAnsi="微软雅黑" w:cs="Helvetica Neue"/>
           <w:kern w:val="0"/>
           <w:sz w:val="24"/>
         </w:rPr>
@@ -8236,6 +8270,14 @@
         </w:rPr>
         <w:t>452.两数之和</w:t>
       </w:r>
+      <w:r>
+        <w:rPr>
+          <w:rFonts w:ascii="微软雅黑" w:eastAsia="微软雅黑" w:hAnsi="微软雅黑" w:cs="Helvetica Neue" w:hint="eastAsia"/>
+          <w:kern w:val="0"/>
+          <w:sz w:val="24"/>
+        </w:rPr>
+        <w:t>（首尾指针）</w:t>
+      </w:r>
     </w:p>
     <w:p>
       <w:pPr>
@@ -8344,9 +8386,1486 @@
     </w:p>
     <w:p>
       <w:pPr>
+        <w:autoSpaceDE w:val="0"/>
+        <w:autoSpaceDN w:val="0"/>
+        <w:adjustRightInd w:val="0"/>
+        <w:spacing w:after="0" w:line="240" w:lineRule="auto"/>
+        <w:rPr>
+          <w:rFonts w:ascii="微软雅黑" w:eastAsia="微软雅黑" w:hAnsi="微软雅黑" w:cs="Helvetica Neue"/>
+          <w:kern w:val="0"/>
+          <w:sz w:val="24"/>
+        </w:rPr>
+      </w:pPr>
+    </w:p>
+    <w:p>
+      <w:pPr>
+        <w:autoSpaceDE w:val="0"/>
+        <w:autoSpaceDN w:val="0"/>
+        <w:adjustRightInd w:val="0"/>
+        <w:spacing w:after="0" w:line="240" w:lineRule="auto"/>
+        <w:rPr>
+          <w:rFonts w:ascii="微软雅黑" w:eastAsia="微软雅黑" w:hAnsi="微软雅黑" w:cs="Helvetica Neue"/>
+          <w:kern w:val="0"/>
+          <w:sz w:val="24"/>
+        </w:rPr>
+      </w:pPr>
+      <w:r>
+        <w:rPr>
+          <w:rFonts w:ascii="微软雅黑" w:eastAsia="微软雅黑" w:hAnsi="微软雅黑" w:cs="Helvetica Neue" w:hint="eastAsia"/>
+          <w:kern w:val="0"/>
+          <w:sz w:val="24"/>
+        </w:rPr>
+        <w:t>88归并数组（两个数组，两个指针）</w:t>
+      </w:r>
+    </w:p>
+    <w:p>
+      <w:pPr>
+        <w:autoSpaceDE w:val="0"/>
+        <w:autoSpaceDN w:val="0"/>
+        <w:adjustRightInd w:val="0"/>
+        <w:spacing w:after="0" w:line="240" w:lineRule="auto"/>
+        <w:rPr>
+          <w:rFonts w:ascii="微软雅黑" w:eastAsia="微软雅黑" w:hAnsi="微软雅黑" w:cs="Helvetica Neue"/>
+          <w:kern w:val="0"/>
+          <w:sz w:val="24"/>
+        </w:rPr>
+      </w:pPr>
+      <w:r>
+        <w:rPr>
+          <w:rFonts w:ascii="微软雅黑" w:eastAsia="微软雅黑" w:hAnsi="微软雅黑" w:cs="Helvetica Neue" w:hint="eastAsia"/>
+          <w:kern w:val="0"/>
+          <w:sz w:val="24"/>
+        </w:rPr>
+        <w:t>思路非常简单，但是有个关键优化：</w:t>
+      </w:r>
+    </w:p>
+    <w:p>
+      <w:pPr>
+        <w:autoSpaceDE w:val="0"/>
+        <w:autoSpaceDN w:val="0"/>
+        <w:adjustRightInd w:val="0"/>
+        <w:spacing w:after="0" w:line="240" w:lineRule="auto"/>
+        <w:rPr>
+          <w:rFonts w:ascii="微软雅黑" w:eastAsia="微软雅黑" w:hAnsi="微软雅黑" w:cs="Helvetica Neue"/>
+          <w:kern w:val="0"/>
+          <w:sz w:val="24"/>
+        </w:rPr>
+      </w:pPr>
+      <w:r>
+        <w:rPr>
+          <w:rFonts w:ascii="微软雅黑" w:eastAsia="微软雅黑" w:hAnsi="微软雅黑" w:cs="Helvetica Neue" w:hint="eastAsia"/>
+          <w:kern w:val="0"/>
+          <w:sz w:val="24"/>
+        </w:rPr>
+        <w:t>从后往前填充（从大向小），可以直接填入nums1，不用额外来一个</w:t>
+      </w:r>
+      <w:proofErr w:type="spellStart"/>
+      <w:r>
+        <w:rPr>
+          <w:rFonts w:ascii="微软雅黑" w:eastAsia="微软雅黑" w:hAnsi="微软雅黑" w:cs="Helvetica Neue" w:hint="eastAsia"/>
+          <w:kern w:val="0"/>
+          <w:sz w:val="24"/>
+        </w:rPr>
+        <w:t>cpy</w:t>
+      </w:r>
+      <w:proofErr w:type="spellEnd"/>
+      <w:r>
+        <w:rPr>
+          <w:rFonts w:ascii="微软雅黑" w:eastAsia="微软雅黑" w:hAnsi="微软雅黑" w:cs="Helvetica Neue" w:hint="eastAsia"/>
+          <w:kern w:val="0"/>
+          <w:sz w:val="24"/>
+        </w:rPr>
+        <w:t>数组</w:t>
+      </w:r>
+    </w:p>
+    <w:p>
+      <w:pPr>
+        <w:autoSpaceDE w:val="0"/>
+        <w:autoSpaceDN w:val="0"/>
+        <w:adjustRightInd w:val="0"/>
+        <w:spacing w:after="0" w:line="240" w:lineRule="auto"/>
+        <w:rPr>
+          <w:rFonts w:ascii="微软雅黑" w:eastAsia="微软雅黑" w:hAnsi="微软雅黑" w:cs="Helvetica Neue"/>
+          <w:kern w:val="0"/>
+          <w:sz w:val="24"/>
+        </w:rPr>
+      </w:pPr>
+    </w:p>
+    <w:p>
+      <w:pPr>
+        <w:autoSpaceDE w:val="0"/>
+        <w:autoSpaceDN w:val="0"/>
+        <w:adjustRightInd w:val="0"/>
+        <w:spacing w:after="0" w:line="240" w:lineRule="auto"/>
+        <w:rPr>
+          <w:rFonts w:ascii="微软雅黑" w:eastAsia="微软雅黑" w:hAnsi="微软雅黑" w:cs="Helvetica Neue"/>
+          <w:kern w:val="0"/>
+          <w:sz w:val="24"/>
+        </w:rPr>
+      </w:pPr>
+      <w:r>
+        <w:rPr>
+          <w:rFonts w:ascii="微软雅黑" w:eastAsia="微软雅黑" w:hAnsi="微软雅黑" w:cs="Helvetica Neue" w:hint="eastAsia"/>
+          <w:kern w:val="0"/>
+          <w:sz w:val="24"/>
+        </w:rPr>
+        <w:t>142循环链表（快慢指针）</w:t>
+      </w:r>
+    </w:p>
+    <w:p>
+      <w:pPr>
+        <w:autoSpaceDE w:val="0"/>
+        <w:autoSpaceDN w:val="0"/>
+        <w:adjustRightInd w:val="0"/>
+        <w:spacing w:after="0" w:line="240" w:lineRule="auto"/>
+        <w:rPr>
+          <w:rFonts w:ascii="微软雅黑" w:eastAsia="微软雅黑" w:hAnsi="微软雅黑" w:cs="Helvetica Neue"/>
+          <w:b/>
+          <w:bCs/>
+          <w:color w:val="7030A0"/>
+          <w:kern w:val="0"/>
+          <w:sz w:val="24"/>
+        </w:rPr>
+      </w:pPr>
+      <w:r>
+        <w:rPr>
+          <w:rFonts w:ascii="微软雅黑" w:eastAsia="微软雅黑" w:hAnsi="微软雅黑" w:cs="Helvetica Neue" w:hint="eastAsia"/>
+          <w:kern w:val="0"/>
+          <w:sz w:val="24"/>
+        </w:rPr>
+        <w:lastRenderedPageBreak/>
+        <w:t>是快慢指针的一个用法，就是利用“速度差”去制造一个“追及问题”，这里循环的长度就是路程差，</w:t>
+      </w:r>
+      <w:r>
+        <w:rPr>
+          <w:rFonts w:ascii="微软雅黑" w:eastAsia="微软雅黑" w:hAnsi="微软雅黑" w:cs="Helvetica Neue" w:hint="eastAsia"/>
+          <w:b/>
+          <w:bCs/>
+          <w:color w:val="7030A0"/>
+          <w:kern w:val="0"/>
+          <w:sz w:val="24"/>
+          <w:highlight w:val="yellow"/>
+        </w:rPr>
+        <w:t>而此方法也是判断某个数据结构是否具有循环特性的一个方法。</w:t>
+      </w:r>
+    </w:p>
+    <w:p>
+      <w:pPr>
+        <w:autoSpaceDE w:val="0"/>
+        <w:autoSpaceDN w:val="0"/>
+        <w:adjustRightInd w:val="0"/>
+        <w:spacing w:after="0" w:line="240" w:lineRule="auto"/>
+        <w:rPr>
+          <w:rFonts w:ascii="微软雅黑" w:eastAsia="微软雅黑" w:hAnsi="微软雅黑" w:cs="Helvetica Neue"/>
+          <w:kern w:val="0"/>
+          <w:sz w:val="24"/>
+        </w:rPr>
+      </w:pPr>
+      <w:r>
+        <w:rPr>
+          <w:rFonts w:ascii="微软雅黑" w:eastAsia="微软雅黑" w:hAnsi="微软雅黑" w:cs="Helvetica Neue" w:hint="eastAsia"/>
+          <w:kern w:val="0"/>
+          <w:sz w:val="24"/>
+        </w:rPr>
+        <w:t>除此之外快慢指针还有一种用法：对于一些要对于顺序存储的数据进行“压缩“处理的问题，比如删除特定元素（重复、负元素</w:t>
+      </w:r>
+      <w:r>
+        <w:rPr>
+          <w:rFonts w:ascii="微软雅黑" w:eastAsia="微软雅黑" w:hAnsi="微软雅黑" w:cs="Helvetica Neue"/>
+          <w:kern w:val="0"/>
+          <w:sz w:val="24"/>
+        </w:rPr>
+        <w:t>...</w:t>
+      </w:r>
+      <w:r>
+        <w:rPr>
+          <w:rFonts w:ascii="微软雅黑" w:eastAsia="微软雅黑" w:hAnsi="微软雅黑" w:cs="Helvetica Neue" w:hint="eastAsia"/>
+          <w:kern w:val="0"/>
+          <w:sz w:val="24"/>
+        </w:rPr>
+        <w:t>）可以用慢指针表示下一个满足的元素要存储在哪，快指针往后遍历，遇到不满足继续往后，遇到满足，快慢指针一起移动，容易理解的是，这里快指针一定走的更快，所以使用慢指针作为索引修改的地方并不会影响到快指针的遍历，可以直接对于慢指针后的部分进行截断，前面的就是目标数据。本质：两个指针，维护一个数据结构的不同部分，互不干扰。</w:t>
+      </w:r>
+    </w:p>
+    <w:p>
+      <w:pPr>
+        <w:autoSpaceDE w:val="0"/>
+        <w:autoSpaceDN w:val="0"/>
+        <w:adjustRightInd w:val="0"/>
+        <w:spacing w:after="0" w:line="240" w:lineRule="auto"/>
+        <w:rPr>
+          <w:rFonts w:ascii="微软雅黑" w:eastAsia="微软雅黑" w:hAnsi="微软雅黑" w:cs="Helvetica Neue"/>
+          <w:kern w:val="0"/>
+          <w:sz w:val="24"/>
+        </w:rPr>
+      </w:pPr>
+    </w:p>
+    <w:p>
+      <w:pPr>
+        <w:autoSpaceDE w:val="0"/>
+        <w:autoSpaceDN w:val="0"/>
+        <w:adjustRightInd w:val="0"/>
+        <w:spacing w:after="0" w:line="240" w:lineRule="auto"/>
+        <w:rPr>
+          <w:rFonts w:ascii="微软雅黑" w:eastAsia="微软雅黑" w:hAnsi="微软雅黑" w:cs="Helvetica Neue" w:hint="eastAsia"/>
+          <w:kern w:val="0"/>
+          <w:sz w:val="24"/>
+        </w:rPr>
+      </w:pPr>
+      <w:r>
+        <w:rPr>
+          <w:rFonts w:ascii="微软雅黑" w:eastAsia="微软雅黑" w:hAnsi="微软雅黑" w:cs="Helvetica Neue" w:hint="eastAsia"/>
+          <w:kern w:val="0"/>
+          <w:sz w:val="24"/>
+        </w:rPr>
+        <w:t>76</w:t>
+      </w:r>
+      <w:r>
+        <w:rPr>
+          <w:rFonts w:ascii="微软雅黑" w:eastAsia="微软雅黑" w:hAnsi="微软雅黑" w:cs="Helvetica Neue"/>
+          <w:kern w:val="0"/>
+          <w:sz w:val="24"/>
+        </w:rPr>
+        <w:t>.</w:t>
+      </w:r>
+      <w:r>
+        <w:rPr>
+          <w:rFonts w:ascii="微软雅黑" w:eastAsia="微软雅黑" w:hAnsi="微软雅黑" w:cs="Helvetica Neue" w:hint="eastAsia"/>
+          <w:kern w:val="0"/>
+          <w:sz w:val="24"/>
+        </w:rPr>
+        <w:t xml:space="preserve"> 最小覆盖字串</w:t>
+      </w:r>
+      <w:r>
+        <w:rPr>
+          <w:rFonts w:ascii="微软雅黑" w:eastAsia="微软雅黑" w:hAnsi="微软雅黑" w:cs="Helvetica Neue" w:hint="eastAsia"/>
+          <w:kern w:val="0"/>
+          <w:sz w:val="24"/>
+        </w:rPr>
+        <w:t>（滑动窗口）</w:t>
+      </w:r>
+    </w:p>
+    <w:p>
+      <w:pPr>
+        <w:autoSpaceDE w:val="0"/>
+        <w:autoSpaceDN w:val="0"/>
+        <w:adjustRightInd w:val="0"/>
+        <w:spacing w:after="0" w:line="240" w:lineRule="auto"/>
+        <w:rPr>
+          <w:rFonts w:ascii="微软雅黑" w:eastAsia="微软雅黑" w:hAnsi="微软雅黑" w:cs="Helvetica Neue"/>
+          <w:kern w:val="0"/>
+          <w:sz w:val="24"/>
+        </w:rPr>
+      </w:pPr>
+      <w:r>
+        <w:rPr>
+          <w:rFonts w:ascii="微软雅黑" w:eastAsia="微软雅黑" w:hAnsi="微软雅黑" w:cs="Helvetica Neue" w:hint="eastAsia"/>
+          <w:kern w:val="0"/>
+          <w:sz w:val="24"/>
+        </w:rPr>
+        <w:t>非常非常经典的滑动窗口题目。</w:t>
+      </w:r>
+    </w:p>
+    <w:p>
+      <w:pPr>
+        <w:autoSpaceDE w:val="0"/>
+        <w:autoSpaceDN w:val="0"/>
+        <w:adjustRightInd w:val="0"/>
+        <w:spacing w:after="0" w:line="240" w:lineRule="auto"/>
+        <w:rPr>
+          <w:rFonts w:ascii="微软雅黑" w:eastAsia="微软雅黑" w:hAnsi="微软雅黑" w:cs="Helvetica Neue"/>
+          <w:kern w:val="0"/>
+          <w:sz w:val="24"/>
+        </w:rPr>
+      </w:pPr>
+      <w:bookmarkStart w:id="20" w:name="_Hlk236590648"/>
+      <w:r>
+        <w:rPr>
+          <w:rFonts w:ascii="微软雅黑" w:eastAsia="微软雅黑" w:hAnsi="微软雅黑" w:cs="Helvetica Neue"/>
+          <w:kern w:val="0"/>
+          <w:sz w:val="24"/>
+        </w:rPr>
+        <w:tab/>
+      </w:r>
+      <w:r>
+        <w:rPr>
+          <w:rFonts w:ascii="微软雅黑" w:eastAsia="微软雅黑" w:hAnsi="微软雅黑" w:cs="Helvetica Neue" w:hint="eastAsia"/>
+          <w:kern w:val="0"/>
+          <w:sz w:val="24"/>
+        </w:rPr>
+        <w:t>不过这里对于我的启示还是：对维护状态的选取，我又是把问题复杂化了。</w:t>
+      </w:r>
+      <w:r>
+        <w:rPr>
+          <w:rFonts w:ascii="微软雅黑" w:eastAsia="微软雅黑" w:hAnsi="微软雅黑" w:cs="Helvetica Neue" w:hint="eastAsia"/>
+          <w:kern w:val="0"/>
+          <w:sz w:val="24"/>
+        </w:rPr>
+        <w:t>（类似射气球）</w:t>
+      </w:r>
+      <w:r>
+        <w:rPr>
+          <w:rFonts w:ascii="微软雅黑" w:eastAsia="微软雅黑" w:hAnsi="微软雅黑" w:cs="Helvetica Neue" w:hint="eastAsia"/>
+          <w:kern w:val="0"/>
+          <w:sz w:val="24"/>
+        </w:rPr>
+        <w:t>原本我想的是，通过修改</w:t>
+      </w:r>
+      <w:r>
+        <w:rPr>
+          <w:rFonts w:ascii="微软雅黑" w:eastAsia="微软雅黑" w:hAnsi="微软雅黑" w:cs="Helvetica Neue" w:hint="eastAsia"/>
+          <w:kern w:val="0"/>
+          <w:sz w:val="24"/>
+        </w:rPr>
+        <w:t>目标的状态，以0为标准判断是否满足，但是这和那题一样，把静态的（目标）强行动态化（变成满足一个减一）再创造一个静态的目标（</w:t>
+      </w:r>
+      <w:r>
+        <w:rPr>
+          <w:rFonts w:ascii="Cambria" w:eastAsia="微软雅黑" w:hAnsi="Cambria" w:cs="Cambria" w:hint="eastAsia"/>
+          <w:kern w:val="0"/>
+          <w:sz w:val="24"/>
+        </w:rPr>
+        <w:t>减到</w:t>
+      </w:r>
+      <w:r>
+        <w:rPr>
+          <w:rFonts w:ascii="Cambria" w:eastAsia="微软雅黑" w:hAnsi="Cambria" w:cs="Cambria" w:hint="eastAsia"/>
+          <w:kern w:val="0"/>
+          <w:sz w:val="24"/>
+        </w:rPr>
+        <w:t>0</w:t>
+      </w:r>
+      <w:r>
+        <w:rPr>
+          <w:rFonts w:ascii="微软雅黑" w:eastAsia="微软雅黑" w:hAnsi="微软雅黑" w:cs="Helvetica Neue" w:hint="eastAsia"/>
+          <w:kern w:val="0"/>
+          <w:sz w:val="24"/>
+        </w:rPr>
+        <w:t>），但是丢失了目标本身的信息（需要多少个哪些字母），把问题复杂化了。</w:t>
+      </w:r>
+      <w:r>
+        <w:rPr>
+          <w:rFonts w:ascii="微软雅黑" w:eastAsia="微软雅黑" w:hAnsi="微软雅黑" w:cs="Helvetica Neue" w:hint="eastAsia"/>
+          <w:kern w:val="0"/>
+          <w:sz w:val="24"/>
+        </w:rPr>
+        <w:t>（</w:t>
+      </w:r>
+      <w:r>
+        <w:rPr>
+          <w:rFonts w:ascii="微软雅黑" w:eastAsia="微软雅黑" w:hAnsi="微软雅黑" w:cs="Helvetica Neue" w:hint="eastAsia"/>
+          <w:kern w:val="0"/>
+          <w:sz w:val="24"/>
+          <w:highlight w:val="yellow"/>
+        </w:rPr>
+        <w:t>想一下和气球的关系</w:t>
+      </w:r>
+      <w:r>
+        <w:rPr>
+          <w:rFonts w:ascii="微软雅黑" w:eastAsia="微软雅黑" w:hAnsi="微软雅黑" w:cs="Helvetica Neue" w:hint="eastAsia"/>
+          <w:kern w:val="0"/>
+          <w:sz w:val="24"/>
+        </w:rPr>
+        <w:t>，</w:t>
+      </w:r>
+      <w:r>
+        <w:rPr>
+          <w:rFonts w:ascii="微软雅黑" w:eastAsia="微软雅黑" w:hAnsi="微软雅黑" w:cs="Helvetica Neue" w:hint="eastAsia"/>
+          <w:kern w:val="0"/>
+          <w:sz w:val="24"/>
+          <w:highlight w:val="yellow"/>
+        </w:rPr>
+        <w:t>气球是我维护气球的状态</w:t>
+      </w:r>
+      <w:r>
+        <w:rPr>
+          <w:rFonts w:ascii="微软雅黑" w:eastAsia="微软雅黑" w:hAnsi="微软雅黑" w:cs="Helvetica Neue" w:hint="eastAsia"/>
+          <w:kern w:val="0"/>
+          <w:sz w:val="24"/>
+        </w:rPr>
+        <w:t>，</w:t>
+      </w:r>
+      <w:r>
+        <w:rPr>
+          <w:rFonts w:ascii="微软雅黑" w:eastAsia="微软雅黑" w:hAnsi="微软雅黑" w:cs="Helvetica Neue" w:hint="eastAsia"/>
+          <w:kern w:val="0"/>
+          <w:sz w:val="24"/>
+          <w:highlight w:val="yellow"/>
+        </w:rPr>
+        <w:t>每射一个就把对应指针置为NULL</w:t>
+      </w:r>
+      <w:r>
+        <w:rPr>
+          <w:rFonts w:ascii="微软雅黑" w:eastAsia="微软雅黑" w:hAnsi="微软雅黑" w:cs="Helvetica Neue" w:hint="eastAsia"/>
+          <w:kern w:val="0"/>
+          <w:sz w:val="24"/>
+        </w:rPr>
+        <w:t>，</w:t>
+      </w:r>
+      <w:r>
+        <w:rPr>
+          <w:rFonts w:ascii="微软雅黑" w:eastAsia="微软雅黑" w:hAnsi="微软雅黑" w:cs="Helvetica Neue" w:hint="eastAsia"/>
+          <w:kern w:val="0"/>
+          <w:sz w:val="24"/>
+          <w:highlight w:val="yellow"/>
+        </w:rPr>
+        <w:t>但是这样就会导致复杂度和错误率提高</w:t>
+      </w:r>
+      <w:r>
+        <w:rPr>
+          <w:rFonts w:ascii="微软雅黑" w:eastAsia="微软雅黑" w:hAnsi="微软雅黑" w:cs="Helvetica Neue" w:hint="eastAsia"/>
+          <w:kern w:val="0"/>
+          <w:sz w:val="24"/>
+        </w:rPr>
+        <w:t>）</w:t>
+      </w:r>
+    </w:p>
+    <w:p>
+      <w:pPr>
+        <w:autoSpaceDE w:val="0"/>
+        <w:autoSpaceDN w:val="0"/>
+        <w:adjustRightInd w:val="0"/>
+        <w:spacing w:after="0" w:line="240" w:lineRule="auto"/>
+        <w:rPr>
+          <w:rFonts w:ascii="微软雅黑" w:eastAsia="微软雅黑" w:hAnsi="微软雅黑" w:cs="Helvetica Neue"/>
+          <w:kern w:val="0"/>
+          <w:sz w:val="24"/>
+        </w:rPr>
+      </w:pPr>
+      <w:bookmarkStart w:id="21" w:name="_Hlk236590749"/>
+      <w:bookmarkStart w:id="22" w:name="_Hlk236590732"/>
+      <w:r>
+        <w:rPr>
+          <w:rFonts w:ascii="微软雅黑" w:eastAsia="微软雅黑" w:hAnsi="微软雅黑" w:cs="Helvetica Neue"/>
+          <w:kern w:val="0"/>
+          <w:sz w:val="24"/>
+        </w:rPr>
+        <w:tab/>
+      </w:r>
+      <w:r>
+        <w:rPr>
+          <w:rFonts w:ascii="微软雅黑" w:eastAsia="微软雅黑" w:hAnsi="微软雅黑" w:cs="Helvetica Neue" w:hint="eastAsia"/>
+          <w:kern w:val="0"/>
+          <w:sz w:val="24"/>
+        </w:rPr>
+        <w:t>我其实想到了额外创造一个数组的想法，</w:t>
+      </w:r>
+      <w:r>
+        <w:rPr>
+          <w:rFonts w:ascii="微软雅黑" w:eastAsia="微软雅黑" w:hAnsi="微软雅黑" w:cs="Helvetica Neue" w:hint="eastAsia"/>
+          <w:kern w:val="0"/>
+          <w:sz w:val="24"/>
+        </w:rPr>
+        <w:t>就是复制目标，还是符合一个减一，其实就和标准的win数组，符合一个</w:t>
+      </w:r>
+      <w:r>
+        <w:rPr>
+          <w:rFonts w:ascii="微软雅黑" w:eastAsia="微软雅黑" w:hAnsi="微软雅黑" w:cs="Helvetica Neue" w:hint="eastAsia"/>
+          <w:kern w:val="0"/>
+          <w:sz w:val="24"/>
+        </w:rPr>
+        <w:t>字母就</w:t>
+      </w:r>
+      <w:r>
+        <w:rPr>
+          <w:rFonts w:ascii="微软雅黑" w:eastAsia="微软雅黑" w:hAnsi="微软雅黑" w:cs="Helvetica Neue" w:hint="eastAsia"/>
+          <w:kern w:val="0"/>
+          <w:sz w:val="24"/>
+        </w:rPr>
+        <w:t>加一，和目标对比是差不多的</w:t>
+      </w:r>
+      <w:r>
+        <w:rPr>
+          <w:rFonts w:ascii="微软雅黑" w:eastAsia="微软雅黑" w:hAnsi="微软雅黑" w:cs="Helvetica Neue" w:hint="eastAsia"/>
+          <w:kern w:val="0"/>
+          <w:sz w:val="24"/>
+        </w:rPr>
+        <w:lastRenderedPageBreak/>
+        <w:t>了</w:t>
+      </w:r>
+      <w:bookmarkEnd w:id="21"/>
+      <w:r>
+        <w:rPr>
+          <w:rFonts w:ascii="微软雅黑" w:eastAsia="微软雅黑" w:hAnsi="微软雅黑" w:cs="Helvetica Neue" w:hint="eastAsia"/>
+          <w:kern w:val="0"/>
+          <w:sz w:val="24"/>
+        </w:rPr>
+        <w:t>。</w:t>
+      </w:r>
+    </w:p>
+    <w:p>
+      <w:pPr>
+        <w:autoSpaceDE w:val="0"/>
+        <w:autoSpaceDN w:val="0"/>
+        <w:adjustRightInd w:val="0"/>
+        <w:spacing w:after="0" w:line="240" w:lineRule="auto"/>
+        <w:rPr>
+          <w:rFonts w:ascii="微软雅黑" w:eastAsia="微软雅黑" w:hAnsi="微软雅黑" w:cs="Helvetica Neue"/>
+          <w:kern w:val="0"/>
+          <w:sz w:val="24"/>
+        </w:rPr>
+      </w:pPr>
+      <w:r>
+        <w:rPr>
+          <w:rFonts w:ascii="微软雅黑" w:eastAsia="微软雅黑" w:hAnsi="微软雅黑" w:cs="Helvetica Neue" w:hint="eastAsia"/>
+          <w:kern w:val="0"/>
+          <w:sz w:val="24"/>
+        </w:rPr>
+        <w:t>633是否存在两数平方和</w:t>
+      </w:r>
+    </w:p>
+    <w:p>
+      <w:pPr>
+        <w:autoSpaceDE w:val="0"/>
+        <w:autoSpaceDN w:val="0"/>
+        <w:adjustRightInd w:val="0"/>
+        <w:spacing w:after="0" w:line="240" w:lineRule="auto"/>
+        <w:rPr>
+          <w:rFonts w:ascii="微软雅黑" w:eastAsia="微软雅黑" w:hAnsi="微软雅黑" w:cs="Helvetica Neue"/>
+          <w:kern w:val="0"/>
+          <w:sz w:val="24"/>
+        </w:rPr>
+      </w:pPr>
+      <w:r>
+        <w:rPr>
+          <w:rFonts w:ascii="微软雅黑" w:eastAsia="微软雅黑" w:hAnsi="微软雅黑" w:cs="Helvetica Neue" w:hint="eastAsia"/>
+          <w:kern w:val="0"/>
+          <w:sz w:val="24"/>
+        </w:rPr>
+        <w:t>和两数之和几乎一样，</w:t>
+      </w:r>
+      <w:r>
+        <w:rPr>
+          <w:rFonts w:ascii="微软雅黑" w:eastAsia="微软雅黑" w:hAnsi="微软雅黑" w:cs="Helvetica Neue" w:hint="eastAsia"/>
+          <w:kern w:val="0"/>
+          <w:sz w:val="24"/>
+        </w:rPr>
+        <w:t>关键依然是在于想到双指针双向遍历的思路</w:t>
+      </w:r>
+    </w:p>
+    <w:p>
+      <w:pPr>
+        <w:autoSpaceDE w:val="0"/>
+        <w:autoSpaceDN w:val="0"/>
+        <w:adjustRightInd w:val="0"/>
+        <w:spacing w:after="0" w:line="240" w:lineRule="auto"/>
+        <w:rPr>
+          <w:rFonts w:ascii="微软雅黑" w:eastAsia="微软雅黑" w:hAnsi="微软雅黑" w:cs="Helvetica Neue"/>
+          <w:kern w:val="0"/>
+          <w:sz w:val="24"/>
+        </w:rPr>
+      </w:pPr>
+      <w:r>
+        <w:rPr>
+          <w:rFonts w:ascii="微软雅黑" w:eastAsia="微软雅黑" w:hAnsi="微软雅黑" w:cs="Helvetica Neue" w:hint="eastAsia"/>
+          <w:kern w:val="0"/>
+          <w:sz w:val="24"/>
+        </w:rPr>
+        <w:t>680可删除一个字符的回文串</w:t>
+      </w:r>
+    </w:p>
+    <w:p>
+      <w:pPr>
+        <w:autoSpaceDE w:val="0"/>
+        <w:autoSpaceDN w:val="0"/>
+        <w:adjustRightInd w:val="0"/>
+        <w:spacing w:after="0" w:line="240" w:lineRule="auto"/>
+        <w:rPr>
+          <w:rFonts w:ascii="微软雅黑" w:eastAsia="微软雅黑" w:hAnsi="微软雅黑" w:cs="Helvetica Neue" w:hint="eastAsia"/>
+          <w:kern w:val="0"/>
+          <w:sz w:val="24"/>
+        </w:rPr>
+      </w:pPr>
+      <w:r>
+        <w:rPr>
+          <w:rFonts w:ascii="微软雅黑" w:eastAsia="微软雅黑" w:hAnsi="微软雅黑" w:cs="Helvetica Neue" w:hint="eastAsia"/>
+          <w:kern w:val="0"/>
+          <w:sz w:val="24"/>
+        </w:rPr>
+        <w:t>思想就是双指针依次验证两边是否回文，这里要注意，遇到不相等的可以删除一个，但是删除哪一个（左边还是右边）会有一个分支，在这里要分类讨论，只要有一个是对的，那就可以返回true</w:t>
+      </w:r>
+    </w:p>
+    <w:p>
+      <w:pPr>
+        <w:autoSpaceDE w:val="0"/>
+        <w:autoSpaceDN w:val="0"/>
+        <w:adjustRightInd w:val="0"/>
+        <w:spacing w:after="0" w:line="240" w:lineRule="auto"/>
+        <w:rPr>
+          <w:rFonts w:ascii="微软雅黑" w:eastAsia="微软雅黑" w:hAnsi="微软雅黑" w:cs="Helvetica Neue" w:hint="eastAsia"/>
+          <w:kern w:val="0"/>
+          <w:sz w:val="24"/>
+        </w:rPr>
+      </w:pPr>
+    </w:p>
+    <w:p>
+      <w:pPr>
+        <w:autoSpaceDE w:val="0"/>
+        <w:autoSpaceDN w:val="0"/>
+        <w:adjustRightInd w:val="0"/>
+        <w:spacing w:after="0" w:line="240" w:lineRule="auto"/>
+        <w:rPr>
+          <w:rFonts w:ascii="微软雅黑" w:eastAsia="微软雅黑" w:hAnsi="微软雅黑" w:cs="Helvetica Neue"/>
+          <w:kern w:val="0"/>
+          <w:sz w:val="24"/>
+        </w:rPr>
+      </w:pPr>
+    </w:p>
+    <w:p>
+      <w:pPr>
         <w:widowControl/>
         <w:rPr>
-          <w:rFonts w:ascii="宋体" w:eastAsia="宋体" w:hAnsi="宋体" w:cs="Helvetica Neue"/>
+          <w:rFonts w:ascii="微软雅黑" w:eastAsia="微软雅黑" w:hAnsi="微软雅黑" w:cs="Helvetica Neue"/>
+          <w:kern w:val="0"/>
+          <w:sz w:val="24"/>
+        </w:rPr>
+      </w:pPr>
+      <w:r>
+        <w:rPr>
+          <w:rFonts w:ascii="微软雅黑" w:eastAsia="微软雅黑" w:hAnsi="微软雅黑" w:cs="Helvetica Neue"/>
+          <w:kern w:val="0"/>
+          <w:sz w:val="24"/>
+        </w:rPr>
+        <w:br w:type="page"/>
+      </w:r>
+    </w:p>
+    <w:p>
+      <w:pPr>
+        <w:widowControl/>
+        <w:jc w:val="center"/>
+        <w:rPr>
+          <w:rFonts w:ascii="微软雅黑" w:eastAsia="微软雅黑" w:hAnsi="微软雅黑" w:cs="Helvetica Neue"/>
+          <w:b/>
+          <w:bCs/>
+          <w:kern w:val="0"/>
+          <w:sz w:val="32"/>
+          <w:szCs w:val="32"/>
+        </w:rPr>
+      </w:pPr>
+      <w:r>
+        <w:rPr>
+          <w:rFonts w:ascii="微软雅黑" w:eastAsia="微软雅黑" w:hAnsi="微软雅黑" w:cs="Helvetica Neue" w:hint="eastAsia"/>
+          <w:b/>
+          <w:bCs/>
+          <w:kern w:val="0"/>
+          <w:sz w:val="32"/>
+          <w:szCs w:val="32"/>
+        </w:rPr>
+        <w:lastRenderedPageBreak/>
+        <w:t>二分查找</w:t>
+      </w:r>
+    </w:p>
+    <w:p>
+      <w:pPr>
+        <w:autoSpaceDE w:val="0"/>
+        <w:autoSpaceDN w:val="0"/>
+        <w:adjustRightInd w:val="0"/>
+        <w:spacing w:after="0" w:line="240" w:lineRule="auto"/>
+        <w:rPr>
+          <w:rFonts w:ascii="微软雅黑" w:eastAsia="微软雅黑" w:hAnsi="微软雅黑" w:cs="Helvetica Neue"/>
+          <w:b/>
+          <w:bCs/>
+          <w:color w:val="EE0000"/>
+          <w:kern w:val="0"/>
+          <w:sz w:val="24"/>
+        </w:rPr>
+      </w:pPr>
+      <w:r>
+        <w:rPr>
+          <w:rFonts w:ascii="微软雅黑" w:eastAsia="微软雅黑" w:hAnsi="微软雅黑" w:cs="Helvetica Neue"/>
+          <w:kern w:val="0"/>
+          <w:sz w:val="24"/>
+        </w:rPr>
+        <w:tab/>
+      </w:r>
+      <w:bookmarkStart w:id="23" w:name="_Hlk236839856"/>
+      <w:r>
+        <w:rPr>
+          <w:rFonts w:ascii="微软雅黑" w:eastAsia="微软雅黑" w:hAnsi="微软雅黑" w:cs="Helvetica Neue" w:hint="eastAsia"/>
+          <w:kern w:val="0"/>
+          <w:sz w:val="24"/>
+        </w:rPr>
+        <w:t>二分查找，最应当关注的不是mid，而是每次更新的区间，</w:t>
+      </w:r>
+      <w:r>
+        <w:rPr>
+          <w:rFonts w:ascii="微软雅黑" w:eastAsia="微软雅黑" w:hAnsi="微软雅黑" w:cs="Helvetica Neue" w:hint="eastAsia"/>
+          <w:b/>
+          <w:bCs/>
+          <w:color w:val="EE0000"/>
+          <w:kern w:val="0"/>
+          <w:sz w:val="24"/>
+          <w:highlight w:val="yellow"/>
+        </w:rPr>
+        <w:t>确保目标始终在这个不断缩小的区间之内</w:t>
+      </w:r>
+      <w:bookmarkEnd w:id="23"/>
+      <w:r>
+        <w:rPr>
+          <w:rFonts w:ascii="微软雅黑" w:eastAsia="微软雅黑" w:hAnsi="微软雅黑" w:cs="Helvetica Neue" w:hint="eastAsia"/>
+          <w:b/>
+          <w:bCs/>
+          <w:color w:val="EE0000"/>
+          <w:kern w:val="0"/>
+          <w:sz w:val="24"/>
+          <w:highlight w:val="yellow"/>
+        </w:rPr>
+        <w:t>。维护变化的区间！</w:t>
+      </w:r>
+    </w:p>
+    <w:p>
+      <w:pPr>
+        <w:autoSpaceDE w:val="0"/>
+        <w:autoSpaceDN w:val="0"/>
+        <w:adjustRightInd w:val="0"/>
+        <w:spacing w:after="0" w:line="240" w:lineRule="auto"/>
+        <w:rPr>
+          <w:rFonts w:ascii="微软雅黑" w:eastAsia="微软雅黑" w:hAnsi="微软雅黑" w:cs="Helvetica Neue"/>
+          <w:kern w:val="0"/>
+          <w:sz w:val="24"/>
+        </w:rPr>
+      </w:pPr>
+      <w:bookmarkStart w:id="24" w:name="_Hlk236840317"/>
+      <w:r>
+        <w:rPr>
+          <w:rFonts w:ascii="微软雅黑" w:eastAsia="微软雅黑" w:hAnsi="微软雅黑" w:cs="Helvetica Neue" w:hint="eastAsia"/>
+          <w:kern w:val="0"/>
+          <w:sz w:val="24"/>
+        </w:rPr>
+        <w:t>69</w:t>
+      </w:r>
+      <w:r>
+        <w:rPr>
+          <w:rFonts w:ascii="微软雅黑" w:eastAsia="微软雅黑" w:hAnsi="微软雅黑" w:cs="Helvetica Neue" w:hint="eastAsia"/>
+          <w:kern w:val="0"/>
+          <w:sz w:val="24"/>
+        </w:rPr>
+        <w:t>平方根</w:t>
+      </w:r>
+    </w:p>
+    <w:p>
+      <w:pPr>
+        <w:autoSpaceDE w:val="0"/>
+        <w:autoSpaceDN w:val="0"/>
+        <w:adjustRightInd w:val="0"/>
+        <w:spacing w:after="0" w:line="240" w:lineRule="auto"/>
+        <w:rPr>
+          <w:rFonts w:ascii="微软雅黑" w:eastAsia="微软雅黑" w:hAnsi="微软雅黑" w:cs="Helvetica Neue"/>
+          <w:kern w:val="0"/>
+          <w:sz w:val="24"/>
+        </w:rPr>
+      </w:pPr>
+      <w:r>
+        <w:rPr>
+          <w:rFonts w:ascii="微软雅黑" w:eastAsia="微软雅黑" w:hAnsi="微软雅黑" w:cs="Helvetica Neue" w:hint="eastAsia"/>
+          <w:kern w:val="0"/>
+          <w:sz w:val="24"/>
+        </w:rPr>
+        <w:t>维护的是平方根应当在这个区间之内，同时返回下界。</w:t>
+      </w:r>
+    </w:p>
+    <w:p>
+      <w:pPr>
+        <w:autoSpaceDE w:val="0"/>
+        <w:autoSpaceDN w:val="0"/>
+        <w:adjustRightInd w:val="0"/>
+        <w:spacing w:after="0" w:line="240" w:lineRule="auto"/>
+        <w:rPr>
+          <w:rFonts w:ascii="微软雅黑" w:eastAsia="微软雅黑" w:hAnsi="微软雅黑" w:cs="Helvetica Neue"/>
+          <w:kern w:val="0"/>
+          <w:sz w:val="24"/>
+        </w:rPr>
+      </w:pPr>
+      <w:r>
+        <w:rPr>
+          <w:rFonts w:ascii="微软雅黑" w:eastAsia="微软雅黑" w:hAnsi="微软雅黑" w:cs="Helvetica Neue" w:hint="eastAsia"/>
+          <w:kern w:val="0"/>
+          <w:sz w:val="24"/>
+        </w:rPr>
+        <w:t>一开始写的是邪修，整数部分不一致就一直继续，用double去算。</w:t>
+      </w:r>
+    </w:p>
+    <w:p>
+      <w:pPr>
+        <w:autoSpaceDE w:val="0"/>
+        <w:autoSpaceDN w:val="0"/>
+        <w:adjustRightInd w:val="0"/>
+        <w:spacing w:after="0" w:line="240" w:lineRule="auto"/>
+        <w:rPr>
+          <w:rFonts w:ascii="微软雅黑" w:eastAsia="微软雅黑" w:hAnsi="微软雅黑" w:cs="Helvetica Neue"/>
+          <w:kern w:val="0"/>
+          <w:sz w:val="24"/>
+        </w:rPr>
+      </w:pPr>
+      <w:r>
+        <w:rPr>
+          <w:rFonts w:ascii="微软雅黑" w:eastAsia="微软雅黑" w:hAnsi="微软雅黑" w:cs="Helvetica Neue" w:hint="eastAsia"/>
+          <w:kern w:val="0"/>
+          <w:sz w:val="24"/>
+        </w:rPr>
+        <w:t>标准思路：根据mid修改左右边界，但是这里会有问题，比如8，mid=2，这样就会最终是</w:t>
+      </w:r>
+      <w:proofErr w:type="spellStart"/>
+      <w:r>
+        <w:rPr>
+          <w:rFonts w:ascii="微软雅黑" w:eastAsia="微软雅黑" w:hAnsi="微软雅黑" w:cs="Helvetica Neue" w:hint="eastAsia"/>
+          <w:kern w:val="0"/>
+          <w:sz w:val="24"/>
+        </w:rPr>
+        <w:t>i</w:t>
+      </w:r>
+      <w:proofErr w:type="spellEnd"/>
+      <w:r>
+        <w:rPr>
+          <w:rFonts w:ascii="微软雅黑" w:eastAsia="微软雅黑" w:hAnsi="微软雅黑" w:cs="Helvetica Neue"/>
+          <w:kern w:val="0"/>
+          <w:sz w:val="24"/>
+        </w:rPr>
+        <w:t>=j=3</w:t>
+      </w:r>
+      <w:r>
+        <w:rPr>
+          <w:rFonts w:ascii="微软雅黑" w:eastAsia="微软雅黑" w:hAnsi="微软雅黑" w:cs="Helvetica Neue" w:hint="eastAsia"/>
+          <w:kern w:val="0"/>
+          <w:sz w:val="24"/>
+        </w:rPr>
+        <w:t>，不过因为我们用的是双闭，3也得到检查，最终是可以通过。可以脑子里面多去模拟一下，是不会出现什么</w:t>
+      </w:r>
+      <w:proofErr w:type="spellStart"/>
+      <w:r>
+        <w:rPr>
+          <w:rFonts w:ascii="微软雅黑" w:eastAsia="微软雅黑" w:hAnsi="微软雅黑" w:cs="Helvetica Neue" w:hint="eastAsia"/>
+          <w:kern w:val="0"/>
+          <w:sz w:val="24"/>
+        </w:rPr>
+        <w:t>ij</w:t>
+      </w:r>
+      <w:proofErr w:type="spellEnd"/>
+      <w:r>
+        <w:rPr>
+          <w:rFonts w:ascii="微软雅黑" w:eastAsia="微软雅黑" w:hAnsi="微软雅黑" w:cs="Helvetica Neue" w:hint="eastAsia"/>
+          <w:kern w:val="0"/>
+          <w:sz w:val="24"/>
+        </w:rPr>
+        <w:t>全比平方根大，全比平方根小的情况的（边界是在约束的），只会发生前面说的，最后一次</w:t>
+      </w:r>
+      <w:proofErr w:type="spellStart"/>
+      <w:r>
+        <w:rPr>
+          <w:rFonts w:ascii="微软雅黑" w:eastAsia="微软雅黑" w:hAnsi="微软雅黑" w:cs="Helvetica Neue" w:hint="eastAsia"/>
+          <w:kern w:val="0"/>
+          <w:sz w:val="24"/>
+        </w:rPr>
+        <w:t>i</w:t>
+      </w:r>
+      <w:proofErr w:type="spellEnd"/>
+      <w:r>
+        <w:rPr>
+          <w:rFonts w:ascii="微软雅黑" w:eastAsia="微软雅黑" w:hAnsi="微软雅黑" w:cs="Helvetica Neue"/>
+          <w:kern w:val="0"/>
+          <w:sz w:val="24"/>
+        </w:rPr>
+        <w:t>=j</w:t>
+      </w:r>
+    </w:p>
+    <w:p>
+      <w:pPr>
+        <w:autoSpaceDE w:val="0"/>
+        <w:autoSpaceDN w:val="0"/>
+        <w:adjustRightInd w:val="0"/>
+        <w:spacing w:after="0" w:line="240" w:lineRule="auto"/>
+        <w:rPr>
+          <w:rFonts w:ascii="微软雅黑" w:eastAsia="微软雅黑" w:hAnsi="微软雅黑" w:cs="Helvetica Neue"/>
+          <w:kern w:val="0"/>
+          <w:sz w:val="24"/>
+        </w:rPr>
+      </w:pPr>
+      <w:r>
+        <w:rPr>
+          <w:rFonts w:ascii="微软雅黑" w:eastAsia="微软雅黑" w:hAnsi="微软雅黑" w:cs="Helvetica Neue" w:hint="eastAsia"/>
+          <w:kern w:val="0"/>
+          <w:sz w:val="24"/>
+        </w:rPr>
+        <w:t>因为mid一定是</w:t>
+      </w:r>
+      <w:r>
+        <w:rPr>
+          <w:rFonts w:ascii="微软雅黑" w:eastAsia="微软雅黑" w:hAnsi="微软雅黑" w:cs="Helvetica Neue"/>
+          <w:kern w:val="0"/>
+          <w:sz w:val="24"/>
+        </w:rPr>
+        <w:t>&lt;j</w:t>
+      </w:r>
+    </w:p>
+    <w:p>
+      <w:pPr>
+        <w:autoSpaceDE w:val="0"/>
+        <w:autoSpaceDN w:val="0"/>
+        <w:adjustRightInd w:val="0"/>
+        <w:spacing w:after="0" w:line="240" w:lineRule="auto"/>
+        <w:rPr>
+          <w:rFonts w:ascii="微软雅黑" w:eastAsia="微软雅黑" w:hAnsi="微软雅黑" w:cs="Helvetica Neue"/>
+          <w:color w:val="EE0000"/>
+          <w:kern w:val="0"/>
+          <w:sz w:val="24"/>
+        </w:rPr>
+      </w:pPr>
+      <w:r>
+        <w:rPr>
+          <w:rFonts w:ascii="微软雅黑" w:eastAsia="微软雅黑" w:hAnsi="微软雅黑" w:cs="Helvetica Neue"/>
+          <w:color w:val="EE0000"/>
+          <w:kern w:val="0"/>
+          <w:sz w:val="24"/>
+        </w:rPr>
+        <w:t>每次更新区间时，都保证答案仍然存在于新区间中。因此不会出现整个区间都排除答案的情况，最后只会收缩到答案附近并完成最后一次判断。</w:t>
+      </w:r>
+    </w:p>
+    <w:p>
+      <w:pPr>
+        <w:autoSpaceDE w:val="0"/>
+        <w:autoSpaceDN w:val="0"/>
+        <w:adjustRightInd w:val="0"/>
+        <w:spacing w:after="0" w:line="240" w:lineRule="auto"/>
+        <w:rPr>
+          <w:rFonts w:ascii="微软雅黑" w:eastAsia="微软雅黑" w:hAnsi="微软雅黑" w:cs="Helvetica Neue"/>
+          <w:color w:val="EE0000"/>
+          <w:kern w:val="0"/>
+          <w:sz w:val="24"/>
+        </w:rPr>
+      </w:pPr>
+    </w:p>
+    <w:p>
+      <w:pPr>
+        <w:autoSpaceDE w:val="0"/>
+        <w:autoSpaceDN w:val="0"/>
+        <w:adjustRightInd w:val="0"/>
+        <w:spacing w:after="0" w:line="240" w:lineRule="auto"/>
+        <w:rPr>
+          <w:rFonts w:ascii="微软雅黑" w:eastAsia="微软雅黑" w:hAnsi="微软雅黑" w:cs="Helvetica Neue"/>
+          <w:kern w:val="0"/>
+          <w:sz w:val="24"/>
+        </w:rPr>
+      </w:pPr>
+      <w:bookmarkStart w:id="25" w:name="_Hlk236840634"/>
+      <w:r>
+        <w:rPr>
+          <w:rFonts w:ascii="微软雅黑" w:eastAsia="微软雅黑" w:hAnsi="微软雅黑" w:cs="Helvetica Neue" w:hint="eastAsia"/>
+          <w:kern w:val="0"/>
+          <w:sz w:val="24"/>
+        </w:rPr>
+        <w:t>34连续目标数字</w:t>
+      </w:r>
+    </w:p>
+    <w:p>
+      <w:pPr>
+        <w:autoSpaceDE w:val="0"/>
+        <w:autoSpaceDN w:val="0"/>
+        <w:adjustRightInd w:val="0"/>
+        <w:spacing w:after="0" w:line="240" w:lineRule="auto"/>
+        <w:rPr>
+          <w:rFonts w:ascii="微软雅黑" w:eastAsia="微软雅黑" w:hAnsi="微软雅黑" w:cs="Helvetica Neue"/>
+          <w:kern w:val="0"/>
+          <w:sz w:val="24"/>
+        </w:rPr>
+      </w:pPr>
+      <w:r>
+        <w:rPr>
+          <w:rFonts w:ascii="微软雅黑" w:eastAsia="微软雅黑" w:hAnsi="微软雅黑" w:cs="Helvetica Neue" w:hint="eastAsia"/>
+          <w:kern w:val="0"/>
+          <w:sz w:val="24"/>
+        </w:rPr>
+        <w:t>这个</w:t>
+      </w:r>
+      <w:r>
+        <w:rPr>
+          <w:rFonts w:ascii="微软雅黑" w:eastAsia="微软雅黑" w:hAnsi="微软雅黑" w:cs="Helvetica Neue" w:hint="eastAsia"/>
+          <w:kern w:val="0"/>
+          <w:sz w:val="24"/>
+        </w:rPr>
+        <w:t>我第二次也是有点模拟的思路，没太掌握到二分查找的精髓。</w:t>
+      </w:r>
+    </w:p>
+    <w:p>
+      <w:pPr>
+        <w:autoSpaceDE w:val="0"/>
+        <w:autoSpaceDN w:val="0"/>
+        <w:adjustRightInd w:val="0"/>
+        <w:spacing w:after="0" w:line="240" w:lineRule="auto"/>
+        <w:rPr>
+          <w:rFonts w:ascii="微软雅黑" w:eastAsia="微软雅黑" w:hAnsi="微软雅黑" w:cs="Helvetica Neue"/>
+          <w:kern w:val="0"/>
+          <w:sz w:val="24"/>
+        </w:rPr>
+      </w:pPr>
+      <w:r>
+        <w:rPr>
+          <w:rFonts w:ascii="微软雅黑" w:eastAsia="微软雅黑" w:hAnsi="微软雅黑" w:cs="Helvetica Neue" w:hint="eastAsia"/>
+          <w:kern w:val="0"/>
+          <w:sz w:val="24"/>
+        </w:rPr>
+        <w:t>我的想法是，根据边界需要满足的条件（自己是，邻元不是）去作为边界更新的标准，但这过于复杂了，实际上是这样：</w:t>
+      </w:r>
+    </w:p>
+    <w:p>
+      <w:pPr>
+        <w:autoSpaceDE w:val="0"/>
+        <w:autoSpaceDN w:val="0"/>
+        <w:adjustRightInd w:val="0"/>
+        <w:spacing w:after="0" w:line="240" w:lineRule="auto"/>
+        <w:rPr>
+          <w:rFonts w:ascii="微软雅黑" w:eastAsia="微软雅黑" w:hAnsi="微软雅黑" w:cs="Helvetica Neue"/>
+          <w:kern w:val="0"/>
+          <w:sz w:val="24"/>
+        </w:rPr>
+      </w:pPr>
+      <w:r>
+        <w:rPr>
+          <w:rFonts w:ascii="微软雅黑" w:eastAsia="微软雅黑" w:hAnsi="微软雅黑" w:cs="Helvetica Neue" w:hint="eastAsia"/>
+          <w:kern w:val="0"/>
+          <w:sz w:val="24"/>
+        </w:rPr>
+        <w:t>因为本质是一个二分的思想，并不需要严格去判断mid是不是边界，而是根据mid的特点，去判定目标是出现在mid左边还是右边，从这个角度而言，其实差不多，只不过</w:t>
+      </w:r>
+      <w:bookmarkStart w:id="26" w:name="_Hlk236840705"/>
+      <w:r>
+        <w:rPr>
+          <w:rFonts w:ascii="微软雅黑" w:eastAsia="微软雅黑" w:hAnsi="微软雅黑" w:cs="Helvetica Neue" w:hint="eastAsia"/>
+          <w:kern w:val="0"/>
+          <w:sz w:val="24"/>
+        </w:rPr>
+        <w:t>我把mid本身看的太重了，以至于需要引入邻元，这就大大增加了复杂度，比如邻元是否越界（虽然我成功AC了）</w:t>
+      </w:r>
+      <w:bookmarkEnd w:id="26"/>
+    </w:p>
+    <w:p>
+      <w:pPr>
+        <w:autoSpaceDE w:val="0"/>
+        <w:autoSpaceDN w:val="0"/>
+        <w:adjustRightInd w:val="0"/>
+        <w:spacing w:after="0" w:line="240" w:lineRule="auto"/>
+        <w:rPr>
+          <w:rFonts w:ascii="微软雅黑" w:eastAsia="微软雅黑" w:hAnsi="微软雅黑" w:cs="Helvetica Neue"/>
+          <w:b/>
+          <w:bCs/>
+          <w:color w:val="EE0000"/>
+          <w:kern w:val="0"/>
+          <w:sz w:val="24"/>
+        </w:rPr>
+      </w:pPr>
+      <w:bookmarkStart w:id="27" w:name="_Hlk236840853"/>
+      <w:r>
+        <w:rPr>
+          <w:rFonts w:ascii="微软雅黑" w:eastAsia="微软雅黑" w:hAnsi="微软雅黑" w:cs="Helvetica Neue" w:hint="eastAsia"/>
+          <w:b/>
+          <w:bCs/>
+          <w:color w:val="EE0000"/>
+          <w:kern w:val="0"/>
+          <w:sz w:val="24"/>
+          <w:highlight w:val="yellow"/>
+        </w:rPr>
+        <w:lastRenderedPageBreak/>
+        <w:t>mid只是判断区间收缩方向的工具，应当维护的是始终包含答案的区间。</w:t>
+      </w:r>
+    </w:p>
+    <w:bookmarkEnd w:id="27"/>
+    <w:p>
+      <w:pPr>
+        <w:autoSpaceDE w:val="0"/>
+        <w:autoSpaceDN w:val="0"/>
+        <w:adjustRightInd w:val="0"/>
+        <w:spacing w:after="0" w:line="240" w:lineRule="auto"/>
+        <w:jc w:val="center"/>
+        <w:rPr>
+          <w:rFonts w:ascii="微软雅黑" w:eastAsia="微软雅黑" w:hAnsi="微软雅黑" w:cs="Helvetica Neue"/>
+          <w:kern w:val="0"/>
+          <w:sz w:val="24"/>
+        </w:rPr>
+      </w:pPr>
+      <w:r>
+        <w:rPr>
+          <w:rFonts w:ascii="微软雅黑" w:eastAsia="微软雅黑" w:hAnsi="微软雅黑" w:cs="Helvetica Neue"/>
+          <w:noProof/>
+          <w:kern w:val="0"/>
+          <w:sz w:val="24"/>
+        </w:rPr>
+        <w:drawing>
+          <wp:inline distT="0" distB="0" distL="0" distR="0" wp14:anchorId="421F1D50" wp14:editId="26DEA8F7">
+            <wp:extent cx="2699657" cy="1758555"/>
+            <wp:effectExtent l="0" t="0" r="5715" b="0"/>
+            <wp:docPr id="1169581670" name="图片 1"/>
+            <wp:cNvGraphicFramePr>
+              <a:graphicFrameLocks xmlns:a="http://schemas.openxmlformats.org/drawingml/2006/main" noChangeAspect="1"/>
+            </wp:cNvGraphicFramePr>
+            <a:graphic xmlns:a="http://schemas.openxmlformats.org/drawingml/2006/main">
+              <a:graphicData uri="http://schemas.openxmlformats.org/drawingml/2006/picture">
+                <pic:pic xmlns:pic="http://schemas.openxmlformats.org/drawingml/2006/picture">
+                  <pic:nvPicPr>
+                    <pic:cNvPr id="1169581670" name=""/>
+                    <pic:cNvPicPr/>
+                  </pic:nvPicPr>
+                  <pic:blipFill>
+                    <a:blip r:embed="rId44"/>
+                    <a:stretch>
+                      <a:fillRect/>
+                    </a:stretch>
+                  </pic:blipFill>
+                  <pic:spPr>
+                    <a:xfrm>
+                      <a:off x="0" y="0"/>
+                      <a:ext cx="2714576" cy="1768273"/>
+                    </a:xfrm>
+                    <a:prstGeom prst="rect">
+                      <a:avLst/>
+                    </a:prstGeom>
+                  </pic:spPr>
+                </pic:pic>
+              </a:graphicData>
+            </a:graphic>
+          </wp:inline>
+        </w:drawing>
+      </w:r>
+    </w:p>
+    <w:p>
+      <w:pPr>
+        <w:autoSpaceDE w:val="0"/>
+        <w:autoSpaceDN w:val="0"/>
+        <w:adjustRightInd w:val="0"/>
+        <w:spacing w:after="0" w:line="240" w:lineRule="auto"/>
+        <w:rPr>
+          <w:rFonts w:ascii="微软雅黑" w:eastAsia="微软雅黑" w:hAnsi="微软雅黑" w:cs="Helvetica Neue"/>
+          <w:kern w:val="0"/>
+          <w:sz w:val="24"/>
+        </w:rPr>
+      </w:pPr>
+      <w:r>
+        <w:rPr>
+          <w:rFonts w:ascii="微软雅黑" w:eastAsia="微软雅黑" w:hAnsi="微软雅黑" w:cs="Helvetica Neue" w:hint="eastAsia"/>
+          <w:kern w:val="0"/>
+          <w:sz w:val="24"/>
+        </w:rPr>
+        <w:t>81、154本质一样</w:t>
+      </w:r>
+    </w:p>
+    <w:p>
+      <w:pPr>
+        <w:autoSpaceDE w:val="0"/>
+        <w:autoSpaceDN w:val="0"/>
+        <w:adjustRightInd w:val="0"/>
+        <w:spacing w:after="0" w:line="240" w:lineRule="auto"/>
+        <w:rPr>
+          <w:rFonts w:ascii="微软雅黑" w:eastAsia="微软雅黑" w:hAnsi="微软雅黑" w:cs="Helvetica Neue"/>
+          <w:kern w:val="0"/>
+          <w:sz w:val="24"/>
+        </w:rPr>
+      </w:pPr>
+      <w:r>
+        <w:rPr>
+          <w:rFonts w:ascii="微软雅黑" w:eastAsia="微软雅黑" w:hAnsi="微软雅黑" w:cs="Helvetica Neue" w:hint="eastAsia"/>
+          <w:kern w:val="0"/>
+          <w:sz w:val="24"/>
+        </w:rPr>
+        <w:t>81找target</w:t>
+      </w:r>
+    </w:p>
+    <w:p>
+      <w:pPr>
+        <w:autoSpaceDE w:val="0"/>
+        <w:autoSpaceDN w:val="0"/>
+        <w:adjustRightInd w:val="0"/>
+        <w:spacing w:after="0" w:line="240" w:lineRule="auto"/>
+        <w:rPr>
+          <w:rFonts w:ascii="微软雅黑" w:eastAsia="微软雅黑" w:hAnsi="微软雅黑" w:cs="Helvetica Neue"/>
+          <w:kern w:val="0"/>
+          <w:sz w:val="24"/>
+        </w:rPr>
+      </w:pPr>
+      <w:r>
+        <w:rPr>
+          <w:rFonts w:ascii="微软雅黑" w:eastAsia="微软雅黑" w:hAnsi="微软雅黑" w:cs="Helvetica Neue"/>
+          <w:kern w:val="0"/>
+          <w:sz w:val="24"/>
+        </w:rPr>
+        <w:tab/>
+      </w:r>
+      <w:r>
+        <w:rPr>
+          <w:rFonts w:ascii="微软雅黑" w:eastAsia="微软雅黑" w:hAnsi="微软雅黑" w:cs="Helvetica Neue" w:hint="eastAsia"/>
+          <w:kern w:val="0"/>
+          <w:sz w:val="24"/>
+        </w:rPr>
+        <w:t>我的方法是找到翻转点，判断目标会出现在哪个半区，在对应半区二分查找</w:t>
+      </w:r>
+    </w:p>
+    <w:p>
+      <w:pPr>
+        <w:autoSpaceDE w:val="0"/>
+        <w:autoSpaceDN w:val="0"/>
+        <w:adjustRightInd w:val="0"/>
+        <w:spacing w:after="0" w:line="240" w:lineRule="auto"/>
+        <w:rPr>
+          <w:rFonts w:ascii="微软雅黑" w:eastAsia="微软雅黑" w:hAnsi="微软雅黑" w:cs="Helvetica Neue"/>
+          <w:kern w:val="0"/>
+          <w:sz w:val="24"/>
+        </w:rPr>
+      </w:pPr>
+      <w:r>
+        <w:rPr>
+          <w:rFonts w:ascii="微软雅黑" w:eastAsia="微软雅黑" w:hAnsi="微软雅黑" w:cs="Helvetica Neue" w:hint="eastAsia"/>
+          <w:kern w:val="0"/>
+          <w:sz w:val="24"/>
+        </w:rPr>
+        <w:t>154找一个反转数组的最小元素</w:t>
+      </w:r>
+      <w:r>
+        <w:rPr>
+          <w:rFonts w:ascii="微软雅黑" w:eastAsia="微软雅黑" w:hAnsi="微软雅黑" w:cs="Helvetica Neue" w:hint="eastAsia"/>
+          <w:kern w:val="0"/>
+          <w:sz w:val="24"/>
+        </w:rPr>
+        <w:t>。</w:t>
+      </w:r>
+    </w:p>
+    <w:p>
+      <w:pPr>
+        <w:autoSpaceDE w:val="0"/>
+        <w:autoSpaceDN w:val="0"/>
+        <w:adjustRightInd w:val="0"/>
+        <w:spacing w:after="0" w:line="240" w:lineRule="auto"/>
+        <w:rPr>
+          <w:rFonts w:ascii="微软雅黑" w:eastAsia="微软雅黑" w:hAnsi="微软雅黑" w:cs="Helvetica Neue"/>
+          <w:kern w:val="0"/>
+          <w:sz w:val="24"/>
+        </w:rPr>
+      </w:pPr>
+      <w:r>
+        <w:rPr>
+          <w:rFonts w:ascii="微软雅黑" w:eastAsia="微软雅黑" w:hAnsi="微软雅黑" w:cs="Helvetica Neue"/>
+          <w:kern w:val="0"/>
+          <w:sz w:val="24"/>
+        </w:rPr>
+        <w:tab/>
+      </w:r>
+      <w:r>
+        <w:rPr>
+          <w:rFonts w:ascii="微软雅黑" w:eastAsia="微软雅黑" w:hAnsi="微软雅黑" w:cs="Helvetica Neue" w:hint="eastAsia"/>
+          <w:kern w:val="0"/>
+          <w:sz w:val="24"/>
+        </w:rPr>
+        <w:t>对于我的算法来说甚至比前一题还简单，直接找翻转点对应的值就可以了</w:t>
+      </w:r>
+    </w:p>
+    <w:p>
+      <w:pPr>
+        <w:autoSpaceDE w:val="0"/>
+        <w:autoSpaceDN w:val="0"/>
+        <w:adjustRightInd w:val="0"/>
+        <w:spacing w:after="0" w:line="240" w:lineRule="auto"/>
+        <w:rPr>
+          <w:rFonts w:ascii="微软雅黑" w:eastAsia="微软雅黑" w:hAnsi="微软雅黑" w:cs="Helvetica Neue"/>
+          <w:kern w:val="0"/>
+          <w:sz w:val="24"/>
+        </w:rPr>
+      </w:pPr>
+      <w:r>
+        <w:rPr>
+          <w:rFonts w:ascii="微软雅黑" w:eastAsia="微软雅黑" w:hAnsi="微软雅黑" w:cs="Helvetica Neue"/>
+          <w:kern w:val="0"/>
+          <w:sz w:val="24"/>
+        </w:rPr>
+        <w:tab/>
+      </w:r>
+      <w:r>
+        <w:rPr>
+          <w:rFonts w:ascii="微软雅黑" w:eastAsia="微软雅黑" w:hAnsi="微软雅黑" w:cs="Helvetica Neue" w:hint="eastAsia"/>
+          <w:kern w:val="0"/>
+          <w:sz w:val="24"/>
+        </w:rPr>
+        <w:t>不过这里就有一个逻辑上或者说马后炮的问题了，官方给81是medium而154是hard，也就是说起码我81的方法有点冗杂了</w:t>
+      </w:r>
+    </w:p>
+    <w:p>
+      <w:pPr>
+        <w:autoSpaceDE w:val="0"/>
+        <w:autoSpaceDN w:val="0"/>
+        <w:adjustRightInd w:val="0"/>
+        <w:spacing w:after="0" w:line="240" w:lineRule="auto"/>
+        <w:rPr>
+          <w:rFonts w:ascii="微软雅黑" w:eastAsia="微软雅黑" w:hAnsi="微软雅黑" w:cs="Helvetica Neue"/>
+          <w:kern w:val="0"/>
+          <w:sz w:val="24"/>
+        </w:rPr>
+      </w:pPr>
+      <w:r>
+        <w:rPr>
+          <w:rFonts w:ascii="微软雅黑" w:eastAsia="微软雅黑" w:hAnsi="微软雅黑" w:cs="Helvetica Neue"/>
+          <w:kern w:val="0"/>
+          <w:sz w:val="24"/>
+        </w:rPr>
+        <w:tab/>
+      </w:r>
+      <w:r>
+        <w:rPr>
+          <w:rFonts w:ascii="微软雅黑" w:eastAsia="微软雅黑" w:hAnsi="微软雅黑" w:cs="Helvetica Neue" w:hint="eastAsia"/>
+          <w:kern w:val="0"/>
+          <w:sz w:val="24"/>
+        </w:rPr>
+        <w:t>大致理解了一下，应该就是说，不必精确找到翻转点，并以此为二分去进行查找。先二分，看在不在其中某个区间，在的话直接找，不在的话</w:t>
+      </w:r>
+      <w:r>
+        <w:rPr>
+          <w:rFonts w:ascii="微软雅黑" w:eastAsia="微软雅黑" w:hAnsi="微软雅黑" w:cs="Helvetica Neue" w:hint="eastAsia"/>
+          <w:kern w:val="0"/>
+          <w:sz w:val="24"/>
+        </w:rPr>
+        <w:t>去另外半区找，这是肯定没问题的（我指的是不在这个半区就在另个半区），注意更新指标（这个是根据33写的，81好像是要考虑相等的情况）</w:t>
+      </w:r>
+    </w:p>
+    <w:p>
+      <w:pPr>
+        <w:autoSpaceDE w:val="0"/>
+        <w:autoSpaceDN w:val="0"/>
+        <w:adjustRightInd w:val="0"/>
+        <w:spacing w:after="0" w:line="240" w:lineRule="auto"/>
+        <w:rPr>
+          <w:rFonts w:ascii="微软雅黑" w:eastAsia="微软雅黑" w:hAnsi="微软雅黑" w:cs="Helvetica Neue"/>
+          <w:kern w:val="0"/>
+          <w:sz w:val="24"/>
+        </w:rPr>
+      </w:pPr>
+      <w:r>
+        <w:rPr>
+          <w:rFonts w:ascii="微软雅黑" w:eastAsia="微软雅黑" w:hAnsi="微软雅黑" w:cs="Helvetica Neue"/>
+          <w:kern w:val="0"/>
+          <w:sz w:val="24"/>
+        </w:rPr>
+        <w:t>540</w:t>
+      </w:r>
+      <w:r>
+        <w:rPr>
+          <w:rFonts w:ascii="微软雅黑" w:eastAsia="微软雅黑" w:hAnsi="微软雅黑" w:cs="Helvetica Neue" w:hint="eastAsia"/>
+          <w:kern w:val="0"/>
+          <w:sz w:val="24"/>
+        </w:rPr>
+        <w:t>找单独出现的数字</w:t>
+      </w:r>
+    </w:p>
+    <w:p>
+      <w:pPr>
+        <w:autoSpaceDE w:val="0"/>
+        <w:autoSpaceDN w:val="0"/>
+        <w:adjustRightInd w:val="0"/>
+        <w:spacing w:after="0" w:line="240" w:lineRule="auto"/>
+        <w:rPr>
+          <w:rFonts w:ascii="微软雅黑" w:eastAsia="微软雅黑" w:hAnsi="微软雅黑" w:cs="Helvetica Neue"/>
+          <w:kern w:val="0"/>
+          <w:sz w:val="24"/>
+        </w:rPr>
+      </w:pPr>
+      <w:r>
+        <w:rPr>
+          <w:rFonts w:ascii="微软雅黑" w:eastAsia="微软雅黑" w:hAnsi="微软雅黑" w:cs="Helvetica Neue"/>
+          <w:kern w:val="0"/>
+          <w:sz w:val="24"/>
+        </w:rPr>
+        <w:tab/>
+      </w:r>
+      <w:r>
+        <w:rPr>
+          <w:rFonts w:ascii="微软雅黑" w:eastAsia="微软雅黑" w:hAnsi="微软雅黑" w:cs="Helvetica Neue" w:hint="eastAsia"/>
+          <w:kern w:val="0"/>
+          <w:sz w:val="24"/>
+        </w:rPr>
+        <w:t>这里最关键的思想就是出现单独的之前，是偶数下标等于下标加一的数，出现之后则变成下标减一的数，由此可以进行二分。</w:t>
+      </w:r>
+    </w:p>
+    <w:p>
+      <w:pPr>
+        <w:autoSpaceDE w:val="0"/>
+        <w:autoSpaceDN w:val="0"/>
+        <w:adjustRightInd w:val="0"/>
+        <w:spacing w:after="0" w:line="240" w:lineRule="auto"/>
+        <w:rPr>
+          <w:rFonts w:ascii="微软雅黑" w:eastAsia="微软雅黑" w:hAnsi="微软雅黑" w:cs="Helvetica Neue"/>
+          <w:kern w:val="0"/>
+          <w:sz w:val="24"/>
+        </w:rPr>
+      </w:pPr>
+      <w:r>
+        <w:rPr>
+          <w:rFonts w:ascii="微软雅黑" w:eastAsia="微软雅黑" w:hAnsi="微软雅黑" w:cs="Helvetica Neue"/>
+          <w:kern w:val="0"/>
+          <w:sz w:val="24"/>
+        </w:rPr>
+        <w:tab/>
+      </w:r>
+      <w:r>
+        <w:rPr>
+          <w:rFonts w:ascii="微软雅黑" w:eastAsia="微软雅黑" w:hAnsi="微软雅黑" w:cs="Helvetica Neue" w:hint="eastAsia"/>
+          <w:kern w:val="0"/>
+          <w:sz w:val="24"/>
+        </w:rPr>
+        <w:t>这里比较关键的是对于边界移动的判断！给我的启示就是不要急着写条件，想好，想好什么情况是确保包括mid的左边是一定不可能出现答案的。</w:t>
+      </w:r>
+    </w:p>
+    <w:p>
+      <w:pPr>
+        <w:autoSpaceDE w:val="0"/>
+        <w:autoSpaceDN w:val="0"/>
+        <w:adjustRightInd w:val="0"/>
+        <w:spacing w:after="0" w:line="240" w:lineRule="auto"/>
+        <w:rPr>
+          <w:rFonts w:ascii="微软雅黑" w:eastAsia="微软雅黑" w:hAnsi="微软雅黑" w:cs="Helvetica Neue"/>
+          <w:kern w:val="0"/>
+          <w:sz w:val="24"/>
+        </w:rPr>
+      </w:pPr>
+      <w:r>
+        <w:rPr>
+          <w:rFonts w:ascii="微软雅黑" w:eastAsia="微软雅黑" w:hAnsi="微软雅黑" w:cs="Helvetica Neue" w:hint="eastAsia"/>
+          <w:kern w:val="0"/>
+          <w:sz w:val="24"/>
+        </w:rPr>
+        <w:lastRenderedPageBreak/>
+        <w:t>于是也有一个一般的设计：</w:t>
+      </w:r>
+    </w:p>
+    <w:p>
+      <w:pPr>
+        <w:autoSpaceDE w:val="0"/>
+        <w:autoSpaceDN w:val="0"/>
+        <w:adjustRightInd w:val="0"/>
+        <w:spacing w:after="0" w:line="240" w:lineRule="auto"/>
+        <w:rPr>
+          <w:rFonts w:ascii="微软雅黑" w:eastAsia="微软雅黑" w:hAnsi="微软雅黑" w:cs="Helvetica Neue" w:hint="eastAsia"/>
+          <w:kern w:val="0"/>
+          <w:sz w:val="24"/>
+        </w:rPr>
+      </w:pPr>
+      <w:r>
+        <w:rPr>
+          <w:rFonts w:ascii="微软雅黑" w:eastAsia="微软雅黑" w:hAnsi="微软雅黑" w:cs="Helvetica Neue"/>
+          <w:kern w:val="0"/>
+          <w:sz w:val="24"/>
+        </w:rPr>
+        <w:tab/>
+      </w:r>
+      <w:r>
+        <w:rPr>
+          <w:rFonts w:ascii="微软雅黑" w:eastAsia="微软雅黑" w:hAnsi="微软雅黑" w:cs="Helvetica Neue" w:hint="eastAsia"/>
+          <w:kern w:val="0"/>
+          <w:sz w:val="24"/>
+        </w:rPr>
+        <w:t>对于二分查找，左闭右开的写法，最后返回l或r都可以，一般写r，因为始终确保的是答案至少在l右侧，最后如果r都到l了，那l就是答案，十分直观；左闭右闭的写法，都有可能，具体看l的定义是第一个不满足的，还是r是最后一个满足的之类的</w:t>
+      </w:r>
+    </w:p>
+    <w:bookmarkEnd w:id="20"/>
+    <w:bookmarkEnd w:id="22"/>
+    <w:bookmarkEnd w:id="24"/>
+    <w:bookmarkEnd w:id="25"/>
+    <w:p>
+      <w:pPr>
+        <w:widowControl/>
+        <w:rPr>
+          <w:rFonts w:ascii="宋体" w:eastAsia="宋体" w:hAnsi="宋体" w:cs="Helvetica Neue" w:hint="eastAsia"/>
           <w:kern w:val="0"/>
           <w:sz w:val="20"/>
           <w:szCs w:val="20"/>
@@ -8354,7 +9873,7 @@
       </w:pPr>
       <w:r>
         <w:rPr>
-          <w:rFonts w:ascii="宋体" w:eastAsia="宋体" w:hAnsi="宋体" w:cs="Helvetica Neue"/>
+          <w:rFonts w:ascii="宋体" w:eastAsia="宋体" w:hAnsi="宋体" w:cs="Helvetica Neue" w:hint="eastAsia"/>
           <w:kern w:val="0"/>
           <w:sz w:val="20"/>
           <w:szCs w:val="20"/>
@@ -8389,20 +9908,16 @@
     </w:p>
     <w:p>
       <w:pPr>
-        <w:pStyle w:val="a9"/>
-        <w:numPr>
-          <w:ilvl w:val="0"/>
-          <w:numId w:val="2"/>
-        </w:numPr>
-        <w:autoSpaceDE w:val="0"/>
-        <w:autoSpaceDN w:val="0"/>
-        <w:adjustRightInd w:val="0"/>
-        <w:spacing w:after="0" w:line="240" w:lineRule="auto"/>
-        <w:rPr>
-          <w:rFonts w:ascii="微软雅黑" w:eastAsia="微软雅黑" w:hAnsi="微软雅黑" w:cs="Helvetica Neue"/>
-          <w:kern w:val="0"/>
-          <w:sz w:val="28"/>
-          <w:szCs w:val="28"/>
+        <w:autoSpaceDE w:val="0"/>
+        <w:autoSpaceDN w:val="0"/>
+        <w:adjustRightInd w:val="0"/>
+        <w:spacing w:after="0" w:line="240" w:lineRule="auto"/>
+        <w:jc w:val="center"/>
+        <w:rPr>
+          <w:rFonts w:ascii="微软雅黑" w:eastAsia="微软雅黑" w:hAnsi="微软雅黑" w:cs="Helvetica Neue"/>
+          <w:kern w:val="0"/>
+          <w:sz w:val="36"/>
+          <w:szCs w:val="36"/>
         </w:rPr>
       </w:pPr>
       <w:r>
@@ -9512,7 +11027,7 @@
                     <pic:cNvPicPr/>
                   </pic:nvPicPr>
                   <pic:blipFill>
-                    <a:blip r:embed="rId44"/>
+                    <a:blip r:embed="rId45"/>
                     <a:stretch>
                       <a:fillRect/>
                     </a:stretch>
@@ -9555,7 +11070,7 @@
                     <pic:cNvPicPr/>
                   </pic:nvPicPr>
                   <pic:blipFill>
-                    <a:blip r:embed="rId45"/>
+                    <a:blip r:embed="rId46"/>
                     <a:stretch>
                       <a:fillRect/>
                     </a:stretch>
@@ -9582,8 +11097,8 @@
         <w:lastRenderedPageBreak/>
         <w:drawing>
           <wp:inline distT="0" distB="0" distL="0" distR="0" wp14:anchorId="6353370E" wp14:editId="1DF12C59">
-            <wp:extent cx="2633403" cy="2159391"/>
-            <wp:effectExtent l="0" t="0" r="0" b="0"/>
+            <wp:extent cx="2293258" cy="1880472"/>
+            <wp:effectExtent l="0" t="0" r="5715" b="0"/>
             <wp:docPr id="1685474389" name="图片 1"/>
             <wp:cNvGraphicFramePr>
               <a:graphicFrameLocks xmlns:a="http://schemas.openxmlformats.org/drawingml/2006/main" noChangeAspect="1"/>
@@ -9596,7 +11111,7 @@
                     <pic:cNvPicPr/>
                   </pic:nvPicPr>
                   <pic:blipFill>
-                    <a:blip r:embed="rId46"/>
+                    <a:blip r:embed="rId47"/>
                     <a:stretch>
                       <a:fillRect/>
                     </a:stretch>
@@ -9604,7 +11119,7 @@
                   <pic:spPr>
                     <a:xfrm>
                       <a:off x="0" y="0"/>
-                      <a:ext cx="2651053" cy="2173864"/>
+                      <a:ext cx="2313097" cy="1896740"/>
                     </a:xfrm>
                     <a:prstGeom prst="rect">
                       <a:avLst/>
@@ -9622,8 +11137,8 @@
         </w:rPr>
         <w:drawing>
           <wp:inline distT="0" distB="0" distL="0" distR="0" wp14:anchorId="4E0EC619" wp14:editId="6706C16D">
-            <wp:extent cx="3765516" cy="1378634"/>
-            <wp:effectExtent l="0" t="0" r="0" b="5715"/>
+            <wp:extent cx="3149600" cy="1153134"/>
+            <wp:effectExtent l="0" t="0" r="0" b="3175"/>
             <wp:docPr id="83310774" name="图片 1"/>
             <wp:cNvGraphicFramePr>
               <a:graphicFrameLocks xmlns:a="http://schemas.openxmlformats.org/drawingml/2006/main" noChangeAspect="1"/>
@@ -9636,7 +11151,7 @@
                     <pic:cNvPicPr/>
                   </pic:nvPicPr>
                   <pic:blipFill>
-                    <a:blip r:embed="rId47"/>
+                    <a:blip r:embed="rId48"/>
                     <a:stretch>
                       <a:fillRect/>
                     </a:stretch>
@@ -9644,7 +11159,7 @@
                   <pic:spPr>
                     <a:xfrm>
                       <a:off x="0" y="0"/>
-                      <a:ext cx="3806030" cy="1393467"/>
+                      <a:ext cx="3191409" cy="1168441"/>
                     </a:xfrm>
                     <a:prstGeom prst="rect">
                       <a:avLst/>
@@ -9679,7 +11194,7 @@
         </w:rPr>
         <w:drawing>
           <wp:inline distT="0" distB="0" distL="0" distR="0" wp14:anchorId="0F12EAE2" wp14:editId="7900176C">
-            <wp:extent cx="5695453" cy="1118382"/>
+            <wp:extent cx="4753429" cy="933403"/>
             <wp:effectExtent l="0" t="0" r="0" b="0"/>
             <wp:docPr id="1358351519" name="图片 1"/>
             <wp:cNvGraphicFramePr>
@@ -9693,7 +11208,7 @@
                     <pic:cNvPicPr/>
                   </pic:nvPicPr>
                   <pic:blipFill>
-                    <a:blip r:embed="rId48"/>
+                    <a:blip r:embed="rId49"/>
                     <a:stretch>
                       <a:fillRect/>
                     </a:stretch>
@@ -9701,7 +11216,7 @@
                   <pic:spPr>
                     <a:xfrm>
                       <a:off x="0" y="0"/>
-                      <a:ext cx="5837320" cy="1146240"/>
+                      <a:ext cx="4896590" cy="961515"/>
                     </a:xfrm>
                     <a:prstGeom prst="rect">
                       <a:avLst/>
@@ -9742,7 +11257,7 @@
                     <pic:cNvPicPr/>
                   </pic:nvPicPr>
                   <pic:blipFill>
-                    <a:blip r:embed="rId49"/>
+                    <a:blip r:embed="rId50"/>
                     <a:stretch>
                       <a:fillRect/>
                     </a:stretch>
@@ -9845,9 +11360,7 @@
         <w:spacing w:after="0" w:line="240" w:lineRule="auto"/>
         <w:ind w:left="0" w:firstLine="442"/>
         <w:rPr>
-          <w:rFonts w:ascii="Consolas" w:eastAsia="微软雅黑" w:hAnsi="Consolas" w:cs="Consolas"/>
-          <w:kern w:val="0"/>
-          <w:szCs w:val="22"/>
+          <w:noProof/>
         </w:rPr>
       </w:pPr>
       <w:r>
@@ -9856,6 +11369,555 @@
           <w:noProof/>
         </w:rPr>
         <w:t>C语言不会让你不知道参数的类型（不会存在不透明传递参数的情况）</w:t>
+      </w:r>
+    </w:p>
+    <w:p>
+      <w:pPr>
+        <w:pStyle w:val="a9"/>
+        <w:autoSpaceDE w:val="0"/>
+        <w:autoSpaceDN w:val="0"/>
+        <w:adjustRightInd w:val="0"/>
+        <w:spacing w:after="0" w:line="240" w:lineRule="auto"/>
+        <w:ind w:left="0" w:firstLine="442"/>
+        <w:rPr>
+          <w:noProof/>
+        </w:rPr>
+      </w:pPr>
+    </w:p>
+    <w:p>
+      <w:pPr>
+        <w:widowControl/>
+        <w:rPr>
+          <w:noProof/>
+        </w:rPr>
+      </w:pPr>
+      <w:r>
+        <w:rPr>
+          <w:noProof/>
+        </w:rPr>
+        <w:br w:type="page"/>
+      </w:r>
+    </w:p>
+    <w:p>
+      <w:pPr>
+        <w:pStyle w:val="a9"/>
+        <w:autoSpaceDE w:val="0"/>
+        <w:autoSpaceDN w:val="0"/>
+        <w:adjustRightInd w:val="0"/>
+        <w:spacing w:after="0" w:line="240" w:lineRule="auto"/>
+        <w:ind w:left="0"/>
+        <w:rPr>
+          <w:rFonts w:ascii="微软雅黑" w:eastAsia="微软雅黑" w:hAnsi="微软雅黑" w:hint="eastAsia"/>
+          <w:b/>
+          <w:bCs/>
+          <w:noProof/>
+          <w:sz w:val="28"/>
+          <w:szCs w:val="28"/>
+        </w:rPr>
+      </w:pPr>
+      <w:r>
+        <w:rPr>
+          <w:rFonts w:ascii="微软雅黑" w:eastAsia="微软雅黑" w:hAnsi="微软雅黑" w:hint="eastAsia"/>
+          <w:b/>
+          <w:bCs/>
+          <w:noProof/>
+          <w:sz w:val="28"/>
+          <w:szCs w:val="28"/>
+        </w:rPr>
+        <w:lastRenderedPageBreak/>
+        <w:t>一</w:t>
+      </w:r>
+      <w:r>
+        <w:rPr>
+          <w:rFonts w:ascii="微软雅黑" w:eastAsia="微软雅黑" w:hAnsi="微软雅黑"/>
+          <w:b/>
+          <w:bCs/>
+          <w:noProof/>
+          <w:sz w:val="28"/>
+          <w:szCs w:val="28"/>
+        </w:rPr>
+        <w:t>.</w:t>
+      </w:r>
+      <w:r>
+        <w:rPr>
+          <w:rFonts w:ascii="微软雅黑" w:eastAsia="微软雅黑" w:hAnsi="微软雅黑" w:hint="eastAsia"/>
+          <w:b/>
+          <w:bCs/>
+          <w:noProof/>
+          <w:sz w:val="28"/>
+          <w:szCs w:val="28"/>
+        </w:rPr>
+        <w:t>快速排序</w:t>
+      </w:r>
+    </w:p>
+    <w:p>
+      <w:pPr>
+        <w:pStyle w:val="a9"/>
+        <w:autoSpaceDE w:val="0"/>
+        <w:autoSpaceDN w:val="0"/>
+        <w:adjustRightInd w:val="0"/>
+        <w:spacing w:after="0" w:line="240" w:lineRule="auto"/>
+        <w:ind w:left="0"/>
+        <w:rPr>
+          <w:rFonts w:ascii="微软雅黑" w:eastAsia="微软雅黑" w:hAnsi="微软雅黑"/>
+          <w:noProof/>
+          <w:sz w:val="24"/>
+          <w:szCs w:val="28"/>
+        </w:rPr>
+      </w:pPr>
+      <w:r>
+        <w:rPr>
+          <w:rFonts w:ascii="微软雅黑" w:eastAsia="微软雅黑" w:hAnsi="微软雅黑" w:hint="eastAsia"/>
+          <w:noProof/>
+          <w:sz w:val="24"/>
+          <w:szCs w:val="28"/>
+        </w:rPr>
+        <w:t>思想：</w:t>
+      </w:r>
+    </w:p>
+    <w:p>
+      <w:pPr>
+        <w:pStyle w:val="a9"/>
+        <w:autoSpaceDE w:val="0"/>
+        <w:autoSpaceDN w:val="0"/>
+        <w:adjustRightInd w:val="0"/>
+        <w:spacing w:after="0" w:line="240" w:lineRule="auto"/>
+        <w:ind w:left="0"/>
+        <w:rPr>
+          <w:rFonts w:ascii="微软雅黑" w:eastAsia="微软雅黑" w:hAnsi="微软雅黑" w:hint="eastAsia"/>
+          <w:noProof/>
+          <w:sz w:val="24"/>
+          <w:szCs w:val="28"/>
+        </w:rPr>
+      </w:pPr>
+      <w:r>
+        <w:rPr>
+          <w:rFonts w:ascii="微软雅黑" w:eastAsia="微软雅黑" w:hAnsi="微软雅黑"/>
+          <w:noProof/>
+          <w:sz w:val="24"/>
+          <w:szCs w:val="28"/>
+        </w:rPr>
+        <w:tab/>
+      </w:r>
+      <w:r>
+        <w:rPr>
+          <w:rFonts w:ascii="微软雅黑" w:eastAsia="微软雅黑" w:hAnsi="微软雅黑" w:hint="eastAsia"/>
+          <w:noProof/>
+          <w:sz w:val="24"/>
+          <w:szCs w:val="28"/>
+        </w:rPr>
+        <w:t>分治法，选择一个“哨兵”</w:t>
+      </w:r>
+      <w:r>
+        <w:rPr>
+          <w:rFonts w:ascii="微软雅黑" w:eastAsia="微软雅黑" w:hAnsi="微软雅黑" w:hint="eastAsia"/>
+          <w:noProof/>
+          <w:sz w:val="24"/>
+          <w:szCs w:val="28"/>
+        </w:rPr>
+        <w:t>（一般是第一个位置）</w:t>
+      </w:r>
+      <w:r>
+        <w:rPr>
+          <w:rFonts w:ascii="微软雅黑" w:eastAsia="微软雅黑" w:hAnsi="微软雅黑" w:hint="eastAsia"/>
+          <w:noProof/>
+          <w:sz w:val="24"/>
+          <w:szCs w:val="28"/>
+        </w:rPr>
+        <w:t>，左右指针遍历一次，</w:t>
+      </w:r>
+      <w:r>
+        <w:rPr>
+          <w:rFonts w:ascii="微软雅黑" w:eastAsia="微软雅黑" w:hAnsi="微软雅黑" w:hint="eastAsia"/>
+          <w:noProof/>
+          <w:sz w:val="24"/>
+          <w:szCs w:val="28"/>
+        </w:rPr>
+        <w:t>目的是把哨兵放到中间，左边均小于哨兵值，右边均大于。之后递归调用，分别处理两次，递归终点是</w:t>
+      </w:r>
+      <w:r>
+        <w:rPr>
+          <w:rFonts w:ascii="微软雅黑" w:eastAsia="微软雅黑" w:hAnsi="微软雅黑"/>
+          <w:noProof/>
+          <w:sz w:val="24"/>
+          <w:szCs w:val="28"/>
+        </w:rPr>
+        <w:t>l+1&gt;=r</w:t>
+      </w:r>
+      <w:r>
+        <w:rPr>
+          <w:rFonts w:ascii="微软雅黑" w:eastAsia="微软雅黑" w:hAnsi="微软雅黑" w:hint="eastAsia"/>
+          <w:noProof/>
+          <w:sz w:val="24"/>
+          <w:szCs w:val="28"/>
+        </w:rPr>
+        <w:t>（因为是左闭右开）</w:t>
+      </w:r>
+    </w:p>
+    <w:p>
+      <w:pPr>
+        <w:pStyle w:val="a9"/>
+        <w:autoSpaceDE w:val="0"/>
+        <w:autoSpaceDN w:val="0"/>
+        <w:adjustRightInd w:val="0"/>
+        <w:spacing w:after="0" w:line="240" w:lineRule="auto"/>
+        <w:ind w:left="0"/>
+        <w:rPr>
+          <w:rFonts w:ascii="微软雅黑" w:eastAsia="微软雅黑" w:hAnsi="微软雅黑"/>
+          <w:noProof/>
+          <w:sz w:val="24"/>
+          <w:szCs w:val="28"/>
+        </w:rPr>
+      </w:pPr>
+      <w:r>
+        <w:rPr>
+          <w:rFonts w:ascii="微软雅黑" w:eastAsia="微软雅黑" w:hAnsi="微软雅黑" w:hint="eastAsia"/>
+          <w:noProof/>
+          <w:sz w:val="24"/>
+          <w:szCs w:val="28"/>
+        </w:rPr>
+        <w:t>代码实现：</w:t>
+      </w:r>
+    </w:p>
+    <w:p>
+      <w:pPr>
+        <w:pStyle w:val="a9"/>
+        <w:autoSpaceDE w:val="0"/>
+        <w:autoSpaceDN w:val="0"/>
+        <w:adjustRightInd w:val="0"/>
+        <w:spacing w:after="0" w:line="240" w:lineRule="auto"/>
+        <w:ind w:left="0"/>
+        <w:rPr>
+          <w:rFonts w:ascii="微软雅黑" w:eastAsia="微软雅黑" w:hAnsi="微软雅黑"/>
+          <w:noProof/>
+          <w:sz w:val="24"/>
+          <w:szCs w:val="28"/>
+        </w:rPr>
+      </w:pPr>
+      <w:r>
+        <w:rPr>
+          <w:rFonts w:ascii="微软雅黑" w:eastAsia="微软雅黑" w:hAnsi="微软雅黑"/>
+          <w:noProof/>
+          <w:sz w:val="24"/>
+          <w:szCs w:val="28"/>
+        </w:rPr>
+        <w:tab/>
+      </w:r>
+      <w:r>
+        <w:rPr>
+          <w:rFonts w:ascii="微软雅黑" w:eastAsia="微软雅黑" w:hAnsi="微软雅黑" w:hint="eastAsia"/>
+          <w:noProof/>
+          <w:sz w:val="24"/>
+          <w:szCs w:val="28"/>
+        </w:rPr>
+        <w:t>第一种方法：交换</w:t>
+      </w:r>
+    </w:p>
+    <w:p>
+      <w:pPr>
+        <w:pStyle w:val="a9"/>
+        <w:autoSpaceDE w:val="0"/>
+        <w:autoSpaceDN w:val="0"/>
+        <w:adjustRightInd w:val="0"/>
+        <w:spacing w:after="0" w:line="240" w:lineRule="auto"/>
+        <w:ind w:left="0"/>
+        <w:rPr>
+          <w:rFonts w:ascii="微软雅黑" w:eastAsia="微软雅黑" w:hAnsi="微软雅黑"/>
+          <w:noProof/>
+          <w:sz w:val="24"/>
+          <w:szCs w:val="28"/>
+        </w:rPr>
+      </w:pPr>
+      <w:r>
+        <w:rPr>
+          <w:rFonts w:ascii="微软雅黑" w:eastAsia="微软雅黑" w:hAnsi="微软雅黑"/>
+          <w:noProof/>
+          <w:sz w:val="24"/>
+          <w:szCs w:val="28"/>
+        </w:rPr>
+        <w:tab/>
+      </w:r>
+      <w:r>
+        <w:rPr>
+          <w:rFonts w:ascii="微软雅黑" w:eastAsia="微软雅黑" w:hAnsi="微软雅黑" w:hint="eastAsia"/>
+          <w:noProof/>
+          <w:sz w:val="24"/>
+          <w:szCs w:val="28"/>
+        </w:rPr>
+        <w:t>左右遍历，直到遇到左边比他大，右边比他小，交换，重复；最后i=j，（注意先移动j，确保是将其移动到i，也就是上一次交换后，是一个小于哨兵的位置）将这个位置与哨兵位置互换。之后继续调用两次，分别对左边（l～j）右边（j+1～r）进行分治处理。</w:t>
+      </w:r>
+    </w:p>
+    <w:p>
+      <w:pPr>
+        <w:pStyle w:val="a9"/>
+        <w:autoSpaceDE w:val="0"/>
+        <w:autoSpaceDN w:val="0"/>
+        <w:adjustRightInd w:val="0"/>
+        <w:spacing w:after="0" w:line="240" w:lineRule="auto"/>
+        <w:ind w:left="0"/>
+        <w:rPr>
+          <w:rFonts w:ascii="微软雅黑" w:eastAsia="微软雅黑" w:hAnsi="微软雅黑"/>
+          <w:noProof/>
+          <w:sz w:val="24"/>
+          <w:szCs w:val="28"/>
+        </w:rPr>
+      </w:pPr>
+      <w:r>
+        <w:rPr>
+          <w:rFonts w:ascii="微软雅黑" w:eastAsia="微软雅黑" w:hAnsi="微软雅黑"/>
+          <w:noProof/>
+          <w:sz w:val="24"/>
+          <w:szCs w:val="28"/>
+        </w:rPr>
+        <w:tab/>
+      </w:r>
+      <w:r>
+        <w:rPr>
+          <w:rFonts w:ascii="微软雅黑" w:eastAsia="微软雅黑" w:hAnsi="微软雅黑" w:hint="eastAsia"/>
+          <w:noProof/>
+          <w:sz w:val="24"/>
+          <w:szCs w:val="28"/>
+        </w:rPr>
+        <w:t>第二张方法：挖坑</w:t>
+      </w:r>
+    </w:p>
+    <w:p>
+      <w:pPr>
+        <w:pStyle w:val="a9"/>
+        <w:autoSpaceDE w:val="0"/>
+        <w:autoSpaceDN w:val="0"/>
+        <w:adjustRightInd w:val="0"/>
+        <w:spacing w:after="0" w:line="240" w:lineRule="auto"/>
+        <w:ind w:left="0"/>
+        <w:rPr>
+          <w:rFonts w:ascii="微软雅黑" w:eastAsia="微软雅黑" w:hAnsi="微软雅黑"/>
+          <w:noProof/>
+          <w:sz w:val="24"/>
+          <w:szCs w:val="28"/>
+        </w:rPr>
+      </w:pPr>
+      <w:r>
+        <w:rPr>
+          <w:rFonts w:ascii="微软雅黑" w:eastAsia="微软雅黑" w:hAnsi="微软雅黑"/>
+          <w:noProof/>
+          <w:sz w:val="24"/>
+          <w:szCs w:val="28"/>
+        </w:rPr>
+        <w:tab/>
+      </w:r>
+      <w:r>
+        <w:rPr>
+          <w:rFonts w:ascii="微软雅黑" w:eastAsia="微软雅黑" w:hAnsi="微软雅黑" w:hint="eastAsia"/>
+          <w:noProof/>
+          <w:sz w:val="24"/>
+          <w:szCs w:val="28"/>
+        </w:rPr>
+        <w:t>这个其实有点难以理解，想法是这样：先把哨兵位置作为坑（要填一个小于哨兵值的），右边遇到不满足的，把那个数填到坑里，那个位置作为新的坑，然后左边往后遍历，直到遇到不满足的，填入坑中。直到i=j循环终止，将哨兵值填入这最后的位置。</w:t>
+      </w:r>
+    </w:p>
+    <w:p>
+      <w:pPr>
+        <w:pStyle w:val="a9"/>
+        <w:autoSpaceDE w:val="0"/>
+        <w:autoSpaceDN w:val="0"/>
+        <w:adjustRightInd w:val="0"/>
+        <w:spacing w:after="0" w:line="240" w:lineRule="auto"/>
+        <w:ind w:left="0"/>
+        <w:rPr>
+          <w:rFonts w:ascii="微软雅黑" w:eastAsia="微软雅黑" w:hAnsi="微软雅黑"/>
+          <w:noProof/>
+          <w:sz w:val="24"/>
+          <w:szCs w:val="28"/>
+        </w:rPr>
+      </w:pPr>
+    </w:p>
+    <w:p>
+      <w:pPr>
+        <w:pStyle w:val="a9"/>
+        <w:autoSpaceDE w:val="0"/>
+        <w:autoSpaceDN w:val="0"/>
+        <w:adjustRightInd w:val="0"/>
+        <w:spacing w:after="0" w:line="240" w:lineRule="auto"/>
+        <w:ind w:left="0"/>
+        <w:rPr>
+          <w:rFonts w:ascii="微软雅黑" w:eastAsia="微软雅黑" w:hAnsi="微软雅黑"/>
+          <w:noProof/>
+          <w:sz w:val="24"/>
+          <w:szCs w:val="28"/>
+        </w:rPr>
+      </w:pPr>
+      <w:r>
+        <w:rPr>
+          <w:rFonts w:ascii="微软雅黑" w:eastAsia="微软雅黑" w:hAnsi="微软雅黑" w:hint="eastAsia"/>
+          <w:noProof/>
+          <w:sz w:val="24"/>
+          <w:szCs w:val="28"/>
+        </w:rPr>
+        <w:t>二</w:t>
+      </w:r>
+      <w:r>
+        <w:rPr>
+          <w:rFonts w:ascii="微软雅黑" w:eastAsia="微软雅黑" w:hAnsi="微软雅黑"/>
+          <w:noProof/>
+          <w:sz w:val="24"/>
+          <w:szCs w:val="28"/>
+        </w:rPr>
+        <w:t>.</w:t>
+      </w:r>
+      <w:r>
+        <w:rPr>
+          <w:rFonts w:ascii="微软雅黑" w:eastAsia="微软雅黑" w:hAnsi="微软雅黑" w:hint="eastAsia"/>
+          <w:noProof/>
+          <w:sz w:val="24"/>
+          <w:szCs w:val="28"/>
+        </w:rPr>
+        <w:t xml:space="preserve"> </w:t>
+      </w:r>
+      <w:r>
+        <w:rPr>
+          <w:rFonts w:ascii="微软雅黑" w:eastAsia="微软雅黑" w:hAnsi="微软雅黑" w:hint="eastAsia"/>
+          <w:noProof/>
+          <w:sz w:val="24"/>
+          <w:szCs w:val="28"/>
+        </w:rPr>
+        <w:t>归并排序</w:t>
+      </w:r>
+    </w:p>
+    <w:p>
+      <w:pPr>
+        <w:pStyle w:val="a9"/>
+        <w:autoSpaceDE w:val="0"/>
+        <w:autoSpaceDN w:val="0"/>
+        <w:adjustRightInd w:val="0"/>
+        <w:spacing w:after="0" w:line="240" w:lineRule="auto"/>
+        <w:ind w:left="0"/>
+        <w:rPr>
+          <w:rFonts w:ascii="微软雅黑" w:eastAsia="微软雅黑" w:hAnsi="微软雅黑"/>
+          <w:noProof/>
+          <w:sz w:val="24"/>
+          <w:szCs w:val="28"/>
+        </w:rPr>
+      </w:pPr>
+      <w:r>
+        <w:rPr>
+          <w:rFonts w:ascii="微软雅黑" w:eastAsia="微软雅黑" w:hAnsi="微软雅黑" w:hint="eastAsia"/>
+          <w:noProof/>
+          <w:sz w:val="24"/>
+          <w:szCs w:val="28"/>
+        </w:rPr>
+        <w:t>想法：递归二分直至区间内只有一个整数，然后回到上一级，第一次是对于两个整数排序，再回到上一层，就是对两个有序数组排序，以此递推</w:t>
+      </w:r>
+    </w:p>
+    <w:p>
+      <w:pPr>
+        <w:pStyle w:val="a9"/>
+        <w:autoSpaceDE w:val="0"/>
+        <w:autoSpaceDN w:val="0"/>
+        <w:adjustRightInd w:val="0"/>
+        <w:spacing w:after="0" w:line="240" w:lineRule="auto"/>
+        <w:ind w:left="0"/>
+        <w:rPr>
+          <w:rFonts w:ascii="微软雅黑" w:eastAsia="微软雅黑" w:hAnsi="微软雅黑"/>
+          <w:noProof/>
+          <w:sz w:val="24"/>
+          <w:szCs w:val="28"/>
+        </w:rPr>
+      </w:pPr>
+      <w:r>
+        <w:rPr>
+          <w:rFonts w:ascii="微软雅黑" w:eastAsia="微软雅黑" w:hAnsi="微软雅黑" w:hint="eastAsia"/>
+          <w:noProof/>
+          <w:sz w:val="24"/>
+          <w:szCs w:val="28"/>
+        </w:rPr>
+        <w:t>代码实现：注意要用另外的数组去储存已经排好的部分，排序的话没啥好说的，就是两个指针，分别遍历，依次比较即可</w:t>
+      </w:r>
+    </w:p>
+    <w:p>
+      <w:pPr>
+        <w:pStyle w:val="a9"/>
+        <w:autoSpaceDE w:val="0"/>
+        <w:autoSpaceDN w:val="0"/>
+        <w:adjustRightInd w:val="0"/>
+        <w:spacing w:after="0" w:line="240" w:lineRule="auto"/>
+        <w:ind w:left="0"/>
+        <w:rPr>
+          <w:rFonts w:ascii="微软雅黑" w:eastAsia="微软雅黑" w:hAnsi="微软雅黑"/>
+          <w:noProof/>
+          <w:sz w:val="24"/>
+          <w:szCs w:val="28"/>
+        </w:rPr>
+      </w:pPr>
+      <w:bookmarkStart w:id="28" w:name="_Hlk237205857"/>
+      <w:r>
+        <w:rPr>
+          <w:rFonts w:ascii="微软雅黑" w:eastAsia="微软雅黑" w:hAnsi="微软雅黑"/>
+          <w:noProof/>
+          <w:sz w:val="24"/>
+          <w:szCs w:val="28"/>
+        </w:rPr>
+        <w:lastRenderedPageBreak/>
+        <w:t>215</w:t>
+      </w:r>
+      <w:r>
+        <w:rPr>
+          <w:rFonts w:ascii="微软雅黑" w:eastAsia="微软雅黑" w:hAnsi="微软雅黑" w:hint="eastAsia"/>
+          <w:noProof/>
+          <w:sz w:val="24"/>
+          <w:szCs w:val="28"/>
+        </w:rPr>
+        <w:t>快速选择</w:t>
+      </w:r>
+    </w:p>
+    <w:p>
+      <w:pPr>
+        <w:pStyle w:val="a9"/>
+        <w:autoSpaceDE w:val="0"/>
+        <w:autoSpaceDN w:val="0"/>
+        <w:adjustRightInd w:val="0"/>
+        <w:spacing w:after="0" w:line="240" w:lineRule="auto"/>
+        <w:ind w:left="0"/>
+        <w:rPr>
+          <w:rFonts w:ascii="微软雅黑" w:eastAsia="微软雅黑" w:hAnsi="微软雅黑"/>
+          <w:noProof/>
+          <w:sz w:val="24"/>
+          <w:szCs w:val="28"/>
+        </w:rPr>
+      </w:pPr>
+      <w:r>
+        <w:rPr>
+          <w:rFonts w:ascii="微软雅黑" w:eastAsia="微软雅黑" w:hAnsi="微软雅黑" w:hint="eastAsia"/>
+          <w:noProof/>
+          <w:sz w:val="24"/>
+          <w:szCs w:val="28"/>
+        </w:rPr>
+        <w:t>与快速排序逻辑类似，唯一的区别就是，这里的不会对数组进行排序，而是判断不断更新的pos指针是不是目标元素的位置，因为如果是的话，最后会把pivot移到这个位置，只需要返回此时pivot的值便可</w:t>
+      </w:r>
+      <w:bookmarkEnd w:id="28"/>
+    </w:p>
+    <w:p>
+      <w:pPr>
+        <w:pStyle w:val="a9"/>
+        <w:autoSpaceDE w:val="0"/>
+        <w:autoSpaceDN w:val="0"/>
+        <w:adjustRightInd w:val="0"/>
+        <w:spacing w:after="0" w:line="240" w:lineRule="auto"/>
+        <w:ind w:left="0"/>
+        <w:rPr>
+          <w:rFonts w:ascii="微软雅黑" w:eastAsia="微软雅黑" w:hAnsi="微软雅黑"/>
+          <w:noProof/>
+          <w:sz w:val="24"/>
+          <w:szCs w:val="28"/>
+        </w:rPr>
+      </w:pPr>
+      <w:r>
+        <w:rPr>
+          <w:rFonts w:ascii="微软雅黑" w:eastAsia="微软雅黑" w:hAnsi="微软雅黑" w:hint="eastAsia"/>
+          <w:noProof/>
+          <w:sz w:val="24"/>
+          <w:szCs w:val="28"/>
+        </w:rPr>
+        <w:t>注意这里的判断条件可以是pos==k，也可以是l==r！</w:t>
       </w:r>
     </w:p>
     <w:sectPr>
@@ -10666,6 +12728,7 @@
   <w:style w:type="character" w:default="1" w:styleId="a0">
     <w:name w:val="Default Paragraph Font"/>
     <w:uiPriority w:val="1"/>
+    <w:semiHidden/>
     <w:unhideWhenUsed/>
   </w:style>
   <w:style w:type="table" w:default="1" w:styleId="a1">

</xml_diff>